<commit_message>
Reporte de estimación de Recursos
</commit_message>
<xml_diff>
--- a/Recursos/RECURSOS.docx
+++ b/Recursos/RECURSOS.docx
@@ -17,7 +17,7 @@
         <mc:AlternateContent>
           <mc:Choice Requires="wpg">
             <w:drawing>
-              <wp:anchor distT="0" distB="0" distL="114300" distR="114300" simplePos="0" relativeHeight="251659264" behindDoc="0" locked="0" layoutInCell="1" allowOverlap="1" wp14:anchorId="654C220A" wp14:editId="5C25A1AA">
+              <wp:anchor distT="0" distB="0" distL="114300" distR="114300" simplePos="0" relativeHeight="251658240" behindDoc="0" locked="0" layoutInCell="1" allowOverlap="1" wp14:anchorId="654C220A" wp14:editId="5C25A1AA">
                 <wp:simplePos x="0" y="0"/>
                 <wp:positionH relativeFrom="margin">
                   <wp:align>center</wp:align>
@@ -415,7 +415,7 @@
           </mc:Choice>
           <mc:Fallback>
             <w:pict>
-              <v:group w14:anchorId="654C220A" id="Grupo 2" o:spid="_x0000_s1026" style="position:absolute;left:0;text-align:left;margin-left:0;margin-top:0;width:630pt;height:807pt;z-index:251659264;mso-position-horizontal:center;mso-position-horizontal-relative:margin;mso-position-vertical:center;mso-position-vertical-relative:margin;mso-width-relative:margin;mso-height-relative:margin" coordsize="80010,102489" o:gfxdata="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">
+              <v:group w14:anchorId="654C220A" id="Grupo 2" o:spid="_x0000_s1026" style="position:absolute;left:0;text-align:left;margin-left:0;margin-top:0;width:630pt;height:807pt;z-index:251658240;mso-position-horizontal:center;mso-position-horizontal-relative:margin;mso-position-vertical:center;mso-position-vertical-relative:margin;mso-width-relative:margin;mso-height-relative:margin" coordsize="80010,102489" o:gfxdata="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">
                 <v:rect id="Rectángulo 1" o:spid="_x0000_s1027" style="position:absolute;width:80010;height:102489;visibility:visible;mso-wrap-style:square;v-text-anchor:middle" o:gfxdata="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" fillcolor="#404040 [2429]" stroked="f" strokeweight="2pt"/>
                 <v:shapetype id="_x0000_t202" coordsize="21600,21600" o:spt="202" path="m,l,21600r21600,l21600,xe">
                   <v:stroke joinstyle="miter"/>
@@ -708,7 +708,6 @@
       <w:sdtEndPr>
         <w:rPr>
           <w:rFonts w:ascii="Arial" w:hAnsi="Arial"/>
-          <w:bCs/>
           <w:lang w:val="es-ES"/>
         </w:rPr>
       </w:sdtEndPr>
@@ -753,7 +752,7 @@
           <w:r>
             <w:fldChar w:fldCharType="separate"/>
           </w:r>
-          <w:hyperlink w:anchor="_Toc224024556" w:history="1">
+          <w:hyperlink w:anchor="_Toc224107856" w:history="1">
             <w:r>
               <w:rPr>
                 <w:rStyle w:val="Hipervnculo"/>
@@ -781,7 +780,7 @@
                 <w:noProof/>
                 <w:webHidden/>
               </w:rPr>
-              <w:instrText xml:space="preserve"> PAGEREF _Toc224024556 \h </w:instrText>
+              <w:instrText xml:space="preserve"> PAGEREF _Toc224107856 \h </w:instrText>
             </w:r>
             <w:r>
               <w:rPr>
@@ -828,7 +827,7 @@
               <w14:ligatures w14:val="standardContextual"/>
             </w:rPr>
           </w:pPr>
-          <w:hyperlink w:anchor="_Toc224024557" w:history="1">
+          <w:hyperlink w:anchor="_Toc224107857" w:history="1">
             <w:r>
               <w:rPr>
                 <w:rStyle w:val="Hipervnculo"/>
@@ -856,7 +855,7 @@
                 <w:noProof/>
                 <w:webHidden/>
               </w:rPr>
-              <w:instrText xml:space="preserve"> PAGEREF _Toc224024557 \h </w:instrText>
+              <w:instrText xml:space="preserve"> PAGEREF _Toc224107857 \h </w:instrText>
             </w:r>
             <w:r>
               <w:rPr>
@@ -903,13 +902,11 @@
               <w14:ligatures w14:val="standardContextual"/>
             </w:rPr>
           </w:pPr>
-          <w:hyperlink w:anchor="_Toc224024558" w:history="1">
+          <w:hyperlink w:anchor="_Toc224107858" w:history="1">
             <w:r>
               <w:rPr>
                 <w:rStyle w:val="Hipervnculo"/>
                 <w:rFonts w:ascii="Aptos" w:hAnsi="Aptos"/>
-                <w:b/>
-                <w:bCs/>
                 <w:noProof/>
                 <w:lang w:val="es-MX"/>
               </w:rPr>
@@ -934,7 +931,7 @@
                 <w:noProof/>
                 <w:webHidden/>
               </w:rPr>
-              <w:instrText xml:space="preserve"> PAGEREF _Toc224024558 \h </w:instrText>
+              <w:instrText xml:space="preserve"> PAGEREF _Toc224107858 \h </w:instrText>
             </w:r>
             <w:r>
               <w:rPr>
@@ -981,13 +978,11 @@
               <w14:ligatures w14:val="standardContextual"/>
             </w:rPr>
           </w:pPr>
-          <w:hyperlink w:anchor="_Toc224024559" w:history="1">
+          <w:hyperlink w:anchor="_Toc224107859" w:history="1">
             <w:r>
               <w:rPr>
                 <w:rStyle w:val="Hipervnculo"/>
                 <w:rFonts w:ascii="Aptos" w:hAnsi="Aptos"/>
-                <w:b/>
-                <w:bCs/>
                 <w:noProof/>
                 <w:lang w:val="es-MX"/>
               </w:rPr>
@@ -1012,7 +1007,7 @@
                 <w:noProof/>
                 <w:webHidden/>
               </w:rPr>
-              <w:instrText xml:space="preserve"> PAGEREF _Toc224024559 \h </w:instrText>
+              <w:instrText xml:space="preserve"> PAGEREF _Toc224107859 \h </w:instrText>
             </w:r>
             <w:r>
               <w:rPr>
@@ -1059,13 +1054,11 @@
               <w14:ligatures w14:val="standardContextual"/>
             </w:rPr>
           </w:pPr>
-          <w:hyperlink w:anchor="_Toc224024560" w:history="1">
+          <w:hyperlink w:anchor="_Toc224107860" w:history="1">
             <w:r>
               <w:rPr>
                 <w:rStyle w:val="Hipervnculo"/>
                 <w:rFonts w:ascii="Aptos" w:hAnsi="Aptos"/>
-                <w:b/>
-                <w:bCs/>
                 <w:noProof/>
                 <w:lang w:val="es-MX"/>
               </w:rPr>
@@ -1090,7 +1083,7 @@
                 <w:noProof/>
                 <w:webHidden/>
               </w:rPr>
-              <w:instrText xml:space="preserve"> PAGEREF _Toc224024560 \h </w:instrText>
+              <w:instrText xml:space="preserve"> PAGEREF _Toc224107860 \h </w:instrText>
             </w:r>
             <w:r>
               <w:rPr>
@@ -1137,13 +1130,11 @@
               <w14:ligatures w14:val="standardContextual"/>
             </w:rPr>
           </w:pPr>
-          <w:hyperlink w:anchor="_Toc224024561" w:history="1">
+          <w:hyperlink w:anchor="_Toc224107861" w:history="1">
             <w:r>
               <w:rPr>
                 <w:rStyle w:val="Hipervnculo"/>
                 <w:rFonts w:ascii="Aptos" w:hAnsi="Aptos"/>
-                <w:b/>
-                <w:bCs/>
                 <w:noProof/>
                 <w:lang w:val="es-MX"/>
               </w:rPr>
@@ -1168,7 +1159,7 @@
                 <w:noProof/>
                 <w:webHidden/>
               </w:rPr>
-              <w:instrText xml:space="preserve"> PAGEREF _Toc224024561 \h </w:instrText>
+              <w:instrText xml:space="preserve"> PAGEREF _Toc224107861 \h </w:instrText>
             </w:r>
             <w:r>
               <w:rPr>
@@ -1188,7 +1179,7 @@
                 <w:noProof/>
                 <w:webHidden/>
               </w:rPr>
-              <w:t>1</w:t>
+              <w:t>2</w:t>
             </w:r>
             <w:r>
               <w:rPr>
@@ -1215,7 +1206,7 @@
               <w14:ligatures w14:val="standardContextual"/>
             </w:rPr>
           </w:pPr>
-          <w:hyperlink w:anchor="_Toc224024562" w:history="1">
+          <w:hyperlink w:anchor="_Toc224107862" w:history="1">
             <w:r>
               <w:rPr>
                 <w:rStyle w:val="Hipervnculo"/>
@@ -1243,7 +1234,7 @@
                 <w:noProof/>
                 <w:webHidden/>
               </w:rPr>
-              <w:instrText xml:space="preserve"> PAGEREF _Toc224024562 \h </w:instrText>
+              <w:instrText xml:space="preserve"> PAGEREF _Toc224107862 \h </w:instrText>
             </w:r>
             <w:r>
               <w:rPr>
@@ -1263,7 +1254,311 @@
                 <w:noProof/>
                 <w:webHidden/>
               </w:rPr>
-              <w:t>1</w:t>
+              <w:t>2</w:t>
+            </w:r>
+            <w:r>
+              <w:rPr>
+                <w:noProof/>
+                <w:webHidden/>
+              </w:rPr>
+              <w:fldChar w:fldCharType="end"/>
+            </w:r>
+          </w:hyperlink>
+        </w:p>
+        <w:p>
+          <w:pPr>
+            <w:pStyle w:val="TDC3"/>
+            <w:tabs>
+              <w:tab w:val="right" w:leader="dot" w:pos="9350"/>
+            </w:tabs>
+            <w:rPr>
+              <w:rFonts w:asciiTheme="minorHAnsi" w:eastAsiaTheme="minorEastAsia" w:hAnsiTheme="minorHAnsi" w:cstheme="minorBidi"/>
+              <w:noProof/>
+              <w:kern w:val="2"/>
+              <w:sz w:val="24"/>
+              <w:szCs w:val="24"/>
+              <w:lang w:val="es-MX"/>
+              <w14:ligatures w14:val="standardContextual"/>
+            </w:rPr>
+          </w:pPr>
+          <w:hyperlink w:anchor="_Toc224107863" w:history="1">
+            <w:r>
+              <w:rPr>
+                <w:rStyle w:val="Hipervnculo"/>
+                <w:rFonts w:ascii="Aptos" w:hAnsi="Aptos"/>
+                <w:noProof/>
+                <w:lang w:val="es-MX"/>
+              </w:rPr>
+              <w:t>Descripción</w:t>
+            </w:r>
+            <w:r>
+              <w:rPr>
+                <w:noProof/>
+                <w:webHidden/>
+              </w:rPr>
+              <w:tab/>
+            </w:r>
+            <w:r>
+              <w:rPr>
+                <w:noProof/>
+                <w:webHidden/>
+              </w:rPr>
+              <w:fldChar w:fldCharType="begin"/>
+            </w:r>
+            <w:r>
+              <w:rPr>
+                <w:noProof/>
+                <w:webHidden/>
+              </w:rPr>
+              <w:instrText xml:space="preserve"> PAGEREF _Toc224107863 \h </w:instrText>
+            </w:r>
+            <w:r>
+              <w:rPr>
+                <w:noProof/>
+                <w:webHidden/>
+              </w:rPr>
+            </w:r>
+            <w:r>
+              <w:rPr>
+                <w:noProof/>
+                <w:webHidden/>
+              </w:rPr>
+              <w:fldChar w:fldCharType="separate"/>
+            </w:r>
+            <w:r>
+              <w:rPr>
+                <w:noProof/>
+                <w:webHidden/>
+              </w:rPr>
+              <w:t>2</w:t>
+            </w:r>
+            <w:r>
+              <w:rPr>
+                <w:noProof/>
+                <w:webHidden/>
+              </w:rPr>
+              <w:fldChar w:fldCharType="end"/>
+            </w:r>
+          </w:hyperlink>
+        </w:p>
+        <w:p>
+          <w:pPr>
+            <w:pStyle w:val="TDC3"/>
+            <w:tabs>
+              <w:tab w:val="right" w:leader="dot" w:pos="9350"/>
+            </w:tabs>
+            <w:rPr>
+              <w:rFonts w:asciiTheme="minorHAnsi" w:eastAsiaTheme="minorEastAsia" w:hAnsiTheme="minorHAnsi" w:cstheme="minorBidi"/>
+              <w:noProof/>
+              <w:kern w:val="2"/>
+              <w:sz w:val="24"/>
+              <w:szCs w:val="24"/>
+              <w:lang w:val="es-MX"/>
+              <w14:ligatures w14:val="standardContextual"/>
+            </w:rPr>
+          </w:pPr>
+          <w:hyperlink w:anchor="_Toc224107864" w:history="1">
+            <w:r>
+              <w:rPr>
+                <w:rStyle w:val="Hipervnculo"/>
+                <w:rFonts w:ascii="Aptos" w:hAnsi="Aptos"/>
+                <w:noProof/>
+                <w:lang w:val="es-MX"/>
+              </w:rPr>
+              <w:t>¿Cuándo se requiere?</w:t>
+            </w:r>
+            <w:r>
+              <w:rPr>
+                <w:noProof/>
+                <w:webHidden/>
+              </w:rPr>
+              <w:tab/>
+            </w:r>
+            <w:r>
+              <w:rPr>
+                <w:noProof/>
+                <w:webHidden/>
+              </w:rPr>
+              <w:fldChar w:fldCharType="begin"/>
+            </w:r>
+            <w:r>
+              <w:rPr>
+                <w:noProof/>
+                <w:webHidden/>
+              </w:rPr>
+              <w:instrText xml:space="preserve"> PAGEREF _Toc224107864 \h </w:instrText>
+            </w:r>
+            <w:r>
+              <w:rPr>
+                <w:noProof/>
+                <w:webHidden/>
+              </w:rPr>
+            </w:r>
+            <w:r>
+              <w:rPr>
+                <w:noProof/>
+                <w:webHidden/>
+              </w:rPr>
+              <w:fldChar w:fldCharType="separate"/>
+            </w:r>
+            <w:r>
+              <w:rPr>
+                <w:noProof/>
+                <w:webHidden/>
+              </w:rPr>
+              <w:t>2</w:t>
+            </w:r>
+            <w:r>
+              <w:rPr>
+                <w:noProof/>
+                <w:webHidden/>
+              </w:rPr>
+              <w:fldChar w:fldCharType="end"/>
+            </w:r>
+          </w:hyperlink>
+        </w:p>
+        <w:p>
+          <w:pPr>
+            <w:pStyle w:val="TDC3"/>
+            <w:tabs>
+              <w:tab w:val="right" w:leader="dot" w:pos="9350"/>
+            </w:tabs>
+            <w:rPr>
+              <w:rFonts w:asciiTheme="minorHAnsi" w:eastAsiaTheme="minorEastAsia" w:hAnsiTheme="minorHAnsi" w:cstheme="minorBidi"/>
+              <w:noProof/>
+              <w:kern w:val="2"/>
+              <w:sz w:val="24"/>
+              <w:szCs w:val="24"/>
+              <w:lang w:val="es-MX"/>
+              <w14:ligatures w14:val="standardContextual"/>
+            </w:rPr>
+          </w:pPr>
+          <w:hyperlink w:anchor="_Toc224107865" w:history="1">
+            <w:r>
+              <w:rPr>
+                <w:rStyle w:val="Hipervnculo"/>
+                <w:rFonts w:ascii="Aptos" w:hAnsi="Aptos"/>
+                <w:noProof/>
+                <w:lang w:val="es-MX"/>
+              </w:rPr>
+              <w:t>Tiempo</w:t>
+            </w:r>
+            <w:r>
+              <w:rPr>
+                <w:noProof/>
+                <w:webHidden/>
+              </w:rPr>
+              <w:tab/>
+            </w:r>
+            <w:r>
+              <w:rPr>
+                <w:noProof/>
+                <w:webHidden/>
+              </w:rPr>
+              <w:fldChar w:fldCharType="begin"/>
+            </w:r>
+            <w:r>
+              <w:rPr>
+                <w:noProof/>
+                <w:webHidden/>
+              </w:rPr>
+              <w:instrText xml:space="preserve"> PAGEREF _Toc224107865 \h </w:instrText>
+            </w:r>
+            <w:r>
+              <w:rPr>
+                <w:noProof/>
+                <w:webHidden/>
+              </w:rPr>
+            </w:r>
+            <w:r>
+              <w:rPr>
+                <w:noProof/>
+                <w:webHidden/>
+              </w:rPr>
+              <w:fldChar w:fldCharType="separate"/>
+            </w:r>
+            <w:r>
+              <w:rPr>
+                <w:noProof/>
+                <w:webHidden/>
+              </w:rPr>
+              <w:t>2</w:t>
+            </w:r>
+            <w:r>
+              <w:rPr>
+                <w:noProof/>
+                <w:webHidden/>
+              </w:rPr>
+              <w:fldChar w:fldCharType="end"/>
+            </w:r>
+          </w:hyperlink>
+        </w:p>
+        <w:p>
+          <w:pPr>
+            <w:pStyle w:val="TDC3"/>
+            <w:tabs>
+              <w:tab w:val="right" w:leader="dot" w:pos="9350"/>
+            </w:tabs>
+            <w:rPr>
+              <w:rFonts w:asciiTheme="minorHAnsi" w:eastAsiaTheme="minorEastAsia" w:hAnsiTheme="minorHAnsi" w:cstheme="minorBidi"/>
+              <w:noProof/>
+              <w:kern w:val="2"/>
+              <w:sz w:val="24"/>
+              <w:szCs w:val="24"/>
+              <w:lang w:val="es-MX"/>
+              <w14:ligatures w14:val="standardContextual"/>
+            </w:rPr>
+          </w:pPr>
+          <w:hyperlink w:anchor="_Toc224107866" w:history="1">
+            <w:r>
+              <w:rPr>
+                <w:rStyle w:val="Hipervnculo"/>
+                <w:rFonts w:ascii="Aptos" w:hAnsi="Aptos"/>
+                <w:noProof/>
+                <w:lang w:val="es-MX"/>
+              </w:rPr>
+              <w:t>Reporte de disponibilidad</w:t>
+            </w:r>
+            <w:r>
+              <w:rPr>
+                <w:noProof/>
+                <w:webHidden/>
+              </w:rPr>
+              <w:tab/>
+            </w:r>
+            <w:r>
+              <w:rPr>
+                <w:noProof/>
+                <w:webHidden/>
+              </w:rPr>
+              <w:fldChar w:fldCharType="begin"/>
+            </w:r>
+            <w:r>
+              <w:rPr>
+                <w:noProof/>
+                <w:webHidden/>
+              </w:rPr>
+              <w:instrText xml:space="preserve"> PAGEREF _Toc224107866 \h </w:instrText>
+            </w:r>
+            <w:r>
+              <w:rPr>
+                <w:noProof/>
+                <w:webHidden/>
+              </w:rPr>
+            </w:r>
+            <w:r>
+              <w:rPr>
+                <w:noProof/>
+                <w:webHidden/>
+              </w:rPr>
+              <w:fldChar w:fldCharType="separate"/>
+            </w:r>
+            <w:r>
+              <w:rPr>
+                <w:noProof/>
+                <w:webHidden/>
+              </w:rPr>
+              <w:t>3</w:t>
             </w:r>
             <w:r>
               <w:rPr>
@@ -1290,7 +1585,7 @@
               <w14:ligatures w14:val="standardContextual"/>
             </w:rPr>
           </w:pPr>
-          <w:hyperlink w:anchor="_Toc224024563" w:history="1">
+          <w:hyperlink w:anchor="_Toc224107867" w:history="1">
             <w:r>
               <w:rPr>
                 <w:rStyle w:val="Hipervnculo"/>
@@ -1318,7 +1613,7 @@
                 <w:noProof/>
                 <w:webHidden/>
               </w:rPr>
-              <w:instrText xml:space="preserve"> PAGEREF _Toc224024563 \h </w:instrText>
+              <w:instrText xml:space="preserve"> PAGEREF _Toc224107867 \h </w:instrText>
             </w:r>
             <w:r>
               <w:rPr>
@@ -1338,7 +1633,311 @@
                 <w:noProof/>
                 <w:webHidden/>
               </w:rPr>
-              <w:t>1</w:t>
+              <w:t>3</w:t>
+            </w:r>
+            <w:r>
+              <w:rPr>
+                <w:noProof/>
+                <w:webHidden/>
+              </w:rPr>
+              <w:fldChar w:fldCharType="end"/>
+            </w:r>
+          </w:hyperlink>
+        </w:p>
+        <w:p>
+          <w:pPr>
+            <w:pStyle w:val="TDC3"/>
+            <w:tabs>
+              <w:tab w:val="right" w:leader="dot" w:pos="9350"/>
+            </w:tabs>
+            <w:rPr>
+              <w:rFonts w:asciiTheme="minorHAnsi" w:eastAsiaTheme="minorEastAsia" w:hAnsiTheme="minorHAnsi" w:cstheme="minorBidi"/>
+              <w:noProof/>
+              <w:kern w:val="2"/>
+              <w:sz w:val="24"/>
+              <w:szCs w:val="24"/>
+              <w:lang w:val="es-MX"/>
+              <w14:ligatures w14:val="standardContextual"/>
+            </w:rPr>
+          </w:pPr>
+          <w:hyperlink w:anchor="_Toc224107868" w:history="1">
+            <w:r>
+              <w:rPr>
+                <w:rStyle w:val="Hipervnculo"/>
+                <w:rFonts w:ascii="Aptos" w:hAnsi="Aptos"/>
+                <w:noProof/>
+                <w:lang w:val="es-MX"/>
+              </w:rPr>
+              <w:t>Descripción</w:t>
+            </w:r>
+            <w:r>
+              <w:rPr>
+                <w:noProof/>
+                <w:webHidden/>
+              </w:rPr>
+              <w:tab/>
+            </w:r>
+            <w:r>
+              <w:rPr>
+                <w:noProof/>
+                <w:webHidden/>
+              </w:rPr>
+              <w:fldChar w:fldCharType="begin"/>
+            </w:r>
+            <w:r>
+              <w:rPr>
+                <w:noProof/>
+                <w:webHidden/>
+              </w:rPr>
+              <w:instrText xml:space="preserve"> PAGEREF _Toc224107868 \h </w:instrText>
+            </w:r>
+            <w:r>
+              <w:rPr>
+                <w:noProof/>
+                <w:webHidden/>
+              </w:rPr>
+            </w:r>
+            <w:r>
+              <w:rPr>
+                <w:noProof/>
+                <w:webHidden/>
+              </w:rPr>
+              <w:fldChar w:fldCharType="separate"/>
+            </w:r>
+            <w:r>
+              <w:rPr>
+                <w:noProof/>
+                <w:webHidden/>
+              </w:rPr>
+              <w:t>3</w:t>
+            </w:r>
+            <w:r>
+              <w:rPr>
+                <w:noProof/>
+                <w:webHidden/>
+              </w:rPr>
+              <w:fldChar w:fldCharType="end"/>
+            </w:r>
+          </w:hyperlink>
+        </w:p>
+        <w:p>
+          <w:pPr>
+            <w:pStyle w:val="TDC3"/>
+            <w:tabs>
+              <w:tab w:val="right" w:leader="dot" w:pos="9350"/>
+            </w:tabs>
+            <w:rPr>
+              <w:rFonts w:asciiTheme="minorHAnsi" w:eastAsiaTheme="minorEastAsia" w:hAnsiTheme="minorHAnsi" w:cstheme="minorBidi"/>
+              <w:noProof/>
+              <w:kern w:val="2"/>
+              <w:sz w:val="24"/>
+              <w:szCs w:val="24"/>
+              <w:lang w:val="es-MX"/>
+              <w14:ligatures w14:val="standardContextual"/>
+            </w:rPr>
+          </w:pPr>
+          <w:hyperlink w:anchor="_Toc224107869" w:history="1">
+            <w:r>
+              <w:rPr>
+                <w:rStyle w:val="Hipervnculo"/>
+                <w:rFonts w:ascii="Aptos" w:hAnsi="Aptos"/>
+                <w:noProof/>
+                <w:lang w:val="es-MX"/>
+              </w:rPr>
+              <w:t>¿Cuándo se requiere?</w:t>
+            </w:r>
+            <w:r>
+              <w:rPr>
+                <w:noProof/>
+                <w:webHidden/>
+              </w:rPr>
+              <w:tab/>
+            </w:r>
+            <w:r>
+              <w:rPr>
+                <w:noProof/>
+                <w:webHidden/>
+              </w:rPr>
+              <w:fldChar w:fldCharType="begin"/>
+            </w:r>
+            <w:r>
+              <w:rPr>
+                <w:noProof/>
+                <w:webHidden/>
+              </w:rPr>
+              <w:instrText xml:space="preserve"> PAGEREF _Toc224107869 \h </w:instrText>
+            </w:r>
+            <w:r>
+              <w:rPr>
+                <w:noProof/>
+                <w:webHidden/>
+              </w:rPr>
+            </w:r>
+            <w:r>
+              <w:rPr>
+                <w:noProof/>
+                <w:webHidden/>
+              </w:rPr>
+              <w:fldChar w:fldCharType="separate"/>
+            </w:r>
+            <w:r>
+              <w:rPr>
+                <w:noProof/>
+                <w:webHidden/>
+              </w:rPr>
+              <w:t>3</w:t>
+            </w:r>
+            <w:r>
+              <w:rPr>
+                <w:noProof/>
+                <w:webHidden/>
+              </w:rPr>
+              <w:fldChar w:fldCharType="end"/>
+            </w:r>
+          </w:hyperlink>
+        </w:p>
+        <w:p>
+          <w:pPr>
+            <w:pStyle w:val="TDC3"/>
+            <w:tabs>
+              <w:tab w:val="right" w:leader="dot" w:pos="9350"/>
+            </w:tabs>
+            <w:rPr>
+              <w:rFonts w:asciiTheme="minorHAnsi" w:eastAsiaTheme="minorEastAsia" w:hAnsiTheme="minorHAnsi" w:cstheme="minorBidi"/>
+              <w:noProof/>
+              <w:kern w:val="2"/>
+              <w:sz w:val="24"/>
+              <w:szCs w:val="24"/>
+              <w:lang w:val="es-MX"/>
+              <w14:ligatures w14:val="standardContextual"/>
+            </w:rPr>
+          </w:pPr>
+          <w:hyperlink w:anchor="_Toc224107870" w:history="1">
+            <w:r>
+              <w:rPr>
+                <w:rStyle w:val="Hipervnculo"/>
+                <w:rFonts w:ascii="Aptos" w:hAnsi="Aptos"/>
+                <w:noProof/>
+                <w:lang w:val="es-MX"/>
+              </w:rPr>
+              <w:t>Tiempo</w:t>
+            </w:r>
+            <w:r>
+              <w:rPr>
+                <w:noProof/>
+                <w:webHidden/>
+              </w:rPr>
+              <w:tab/>
+            </w:r>
+            <w:r>
+              <w:rPr>
+                <w:noProof/>
+                <w:webHidden/>
+              </w:rPr>
+              <w:fldChar w:fldCharType="begin"/>
+            </w:r>
+            <w:r>
+              <w:rPr>
+                <w:noProof/>
+                <w:webHidden/>
+              </w:rPr>
+              <w:instrText xml:space="preserve"> PAGEREF _Toc224107870 \h </w:instrText>
+            </w:r>
+            <w:r>
+              <w:rPr>
+                <w:noProof/>
+                <w:webHidden/>
+              </w:rPr>
+            </w:r>
+            <w:r>
+              <w:rPr>
+                <w:noProof/>
+                <w:webHidden/>
+              </w:rPr>
+              <w:fldChar w:fldCharType="separate"/>
+            </w:r>
+            <w:r>
+              <w:rPr>
+                <w:noProof/>
+                <w:webHidden/>
+              </w:rPr>
+              <w:t>3</w:t>
+            </w:r>
+            <w:r>
+              <w:rPr>
+                <w:noProof/>
+                <w:webHidden/>
+              </w:rPr>
+              <w:fldChar w:fldCharType="end"/>
+            </w:r>
+          </w:hyperlink>
+        </w:p>
+        <w:p>
+          <w:pPr>
+            <w:pStyle w:val="TDC3"/>
+            <w:tabs>
+              <w:tab w:val="right" w:leader="dot" w:pos="9350"/>
+            </w:tabs>
+            <w:rPr>
+              <w:rFonts w:asciiTheme="minorHAnsi" w:eastAsiaTheme="minorEastAsia" w:hAnsiTheme="minorHAnsi" w:cstheme="minorBidi"/>
+              <w:noProof/>
+              <w:kern w:val="2"/>
+              <w:sz w:val="24"/>
+              <w:szCs w:val="24"/>
+              <w:lang w:val="es-MX"/>
+              <w14:ligatures w14:val="standardContextual"/>
+            </w:rPr>
+          </w:pPr>
+          <w:hyperlink w:anchor="_Toc224107871" w:history="1">
+            <w:r>
+              <w:rPr>
+                <w:rStyle w:val="Hipervnculo"/>
+                <w:rFonts w:ascii="Aptos" w:hAnsi="Aptos"/>
+                <w:noProof/>
+                <w:lang w:val="es-MX"/>
+              </w:rPr>
+              <w:t>Reporte de disponibilidad</w:t>
+            </w:r>
+            <w:r>
+              <w:rPr>
+                <w:noProof/>
+                <w:webHidden/>
+              </w:rPr>
+              <w:tab/>
+            </w:r>
+            <w:r>
+              <w:rPr>
+                <w:noProof/>
+                <w:webHidden/>
+              </w:rPr>
+              <w:fldChar w:fldCharType="begin"/>
+            </w:r>
+            <w:r>
+              <w:rPr>
+                <w:noProof/>
+                <w:webHidden/>
+              </w:rPr>
+              <w:instrText xml:space="preserve"> PAGEREF _Toc224107871 \h </w:instrText>
+            </w:r>
+            <w:r>
+              <w:rPr>
+                <w:noProof/>
+                <w:webHidden/>
+              </w:rPr>
+            </w:r>
+            <w:r>
+              <w:rPr>
+                <w:noProof/>
+                <w:webHidden/>
+              </w:rPr>
+              <w:fldChar w:fldCharType="separate"/>
+            </w:r>
+            <w:r>
+              <w:rPr>
+                <w:noProof/>
+                <w:webHidden/>
+              </w:rPr>
+              <w:t>4</w:t>
             </w:r>
             <w:r>
               <w:rPr>
@@ -1365,7 +1964,7 @@
               <w14:ligatures w14:val="standardContextual"/>
             </w:rPr>
           </w:pPr>
-          <w:hyperlink w:anchor="_Toc224024564" w:history="1">
+          <w:hyperlink w:anchor="_Toc224107872" w:history="1">
             <w:r>
               <w:rPr>
                 <w:rStyle w:val="Hipervnculo"/>
@@ -1393,7 +1992,7 @@
                 <w:noProof/>
                 <w:webHidden/>
               </w:rPr>
-              <w:instrText xml:space="preserve"> PAGEREF _Toc224024564 \h </w:instrText>
+              <w:instrText xml:space="preserve"> PAGEREF _Toc224107872 \h </w:instrText>
             </w:r>
             <w:r>
               <w:rPr>
@@ -1413,7 +2012,7 @@
                 <w:noProof/>
                 <w:webHidden/>
               </w:rPr>
-              <w:t>1</w:t>
+              <w:t>4</w:t>
             </w:r>
             <w:r>
               <w:rPr>
@@ -1440,7 +2039,7 @@
               <w14:ligatures w14:val="standardContextual"/>
             </w:rPr>
           </w:pPr>
-          <w:hyperlink w:anchor="_Toc224024565" w:history="1">
+          <w:hyperlink w:anchor="_Toc224107873" w:history="1">
             <w:r>
               <w:rPr>
                 <w:rStyle w:val="Hipervnculo"/>
@@ -1468,7 +2067,7 @@
                 <w:noProof/>
                 <w:webHidden/>
               </w:rPr>
-              <w:instrText xml:space="preserve"> PAGEREF _Toc224024565 \h </w:instrText>
+              <w:instrText xml:space="preserve"> PAGEREF _Toc224107873 \h </w:instrText>
             </w:r>
             <w:r>
               <w:rPr>
@@ -1488,7 +2087,7 @@
                 <w:noProof/>
                 <w:webHidden/>
               </w:rPr>
-              <w:t>1</w:t>
+              <w:t>4</w:t>
             </w:r>
             <w:r>
               <w:rPr>
@@ -1548,7 +2147,7 @@
           <w:rFonts w:ascii="Aptos" w:hAnsi="Aptos"/>
         </w:rPr>
       </w:pPr>
-      <w:bookmarkStart w:id="1" w:name="_Toc224024556"/>
+      <w:bookmarkStart w:id="1" w:name="_Toc224107856"/>
       <w:r>
         <w:rPr>
           <w:rFonts w:ascii="Aptos" w:hAnsi="Aptos"/>
@@ -1625,7 +2224,7 @@
           <w:rFonts w:ascii="Aptos" w:hAnsi="Aptos"/>
         </w:rPr>
       </w:pPr>
-      <w:bookmarkStart w:id="2" w:name="_Toc224024557"/>
+      <w:bookmarkStart w:id="2" w:name="_Toc224107857"/>
       <w:r>
         <w:rPr>
           <w:rFonts w:ascii="Aptos" w:hAnsi="Aptos"/>
@@ -1677,9 +2276,9 @@
         <w:tblLook w:val="04A0" w:firstRow="1" w:lastRow="0" w:firstColumn="1" w:lastColumn="0" w:noHBand="0" w:noVBand="1"/>
       </w:tblPr>
       <w:tblGrid>
-        <w:gridCol w:w="3829"/>
-        <w:gridCol w:w="2771"/>
-        <w:gridCol w:w="2750"/>
+        <w:gridCol w:w="3812"/>
+        <w:gridCol w:w="2809"/>
+        <w:gridCol w:w="2729"/>
       </w:tblGrid>
       <w:tr>
         <w:trPr>
@@ -1707,7 +2306,7 @@
                 <w:lang w:val="es-MX"/>
               </w:rPr>
             </w:pPr>
-            <w:bookmarkStart w:id="3" w:name="_Toc224024558"/>
+            <w:bookmarkStart w:id="3" w:name="_Toc224107858"/>
             <w:r>
               <w:rPr>
                 <w:rFonts w:ascii="Aptos" w:hAnsi="Aptos"/>
@@ -1744,7 +2343,7 @@
                 <w:lang w:val="es-MX"/>
               </w:rPr>
             </w:pPr>
-            <w:bookmarkStart w:id="4" w:name="_Toc224024559"/>
+            <w:bookmarkStart w:id="4" w:name="_Toc224107859"/>
             <w:r>
               <w:rPr>
                 <w:rFonts w:ascii="Aptos" w:hAnsi="Aptos"/>
@@ -1781,7 +2380,7 @@
                 <w:lang w:val="es-MX"/>
               </w:rPr>
             </w:pPr>
-            <w:bookmarkStart w:id="5" w:name="_Toc224024560"/>
+            <w:bookmarkStart w:id="5" w:name="_Toc224107860"/>
             <w:r>
               <w:rPr>
                 <w:rFonts w:ascii="Aptos" w:hAnsi="Aptos"/>
@@ -1815,6 +2414,31 @@
                 <w:lang w:val="es-MX"/>
               </w:rPr>
             </w:pPr>
+            <w:r>
+              <w:rPr>
+                <w:rFonts w:ascii="Aptos" w:hAnsi="Aptos"/>
+                <w:b/>
+                <w:bCs/>
+                <w:lang w:val="es-MX"/>
+              </w:rPr>
+              <w:t>Leonardo Merino Garfias</w:t>
+            </w:r>
+            <w:r>
+              <w:rPr>
+                <w:rFonts w:ascii="Aptos" w:hAnsi="Aptos"/>
+                <w:b/>
+                <w:bCs/>
+                <w:lang w:val="es-MX"/>
+              </w:rPr>
+              <w:t>.</w:t>
+            </w:r>
+            <w:r>
+              <w:rPr>
+                <w:rFonts w:ascii="Aptos" w:hAnsi="Aptos"/>
+                <w:lang w:val="es-MX"/>
+              </w:rPr>
+              <w:t xml:space="preserve"> Desarrollador Backend. Responsable de la estructura base del sistema, configuración del servidor, organización de archivos, optimización de carga y despliegue final del sitio.</w:t>
+            </w:r>
           </w:p>
         </w:tc>
         <w:tc>
@@ -1822,6 +2446,511 @@
             <w:tcW w:w="2928" w:type="dxa"/>
             <w:vAlign w:val="center"/>
           </w:tcPr>
+          <w:p>
+            <w:pPr>
+              <w:rPr>
+                <w:rFonts w:ascii="Aptos" w:hAnsi="Aptos"/>
+                <w:lang w:val="es-MX"/>
+              </w:rPr>
+            </w:pPr>
+            <w:r>
+              <w:rPr>
+                <w:rFonts w:ascii="Aptos" w:hAnsi="Aptos"/>
+                <w:lang w:val="es-MX"/>
+              </w:rPr>
+              <w:t>Principalmente durante el Sprint 1 (semanas 1-2) para la construcción de la estructura base, y durante el Sprint 4 (semanas 7-8) para las pruebas finales, optimización y despliegue en el hosting. Disponible para soporte durante los Sprints intermedios.</w:t>
+            </w:r>
+          </w:p>
+        </w:tc>
+        <w:tc>
+          <w:tcPr>
+            <w:tcW w:w="2929" w:type="dxa"/>
+            <w:vAlign w:val="center"/>
+          </w:tcPr>
+          <w:p>
+            <w:pPr>
+              <w:rPr>
+                <w:rFonts w:ascii="Aptos" w:hAnsi="Aptos"/>
+                <w:lang w:val="es-MX"/>
+              </w:rPr>
+            </w:pPr>
+            <w:r>
+              <w:rPr>
+                <w:rFonts w:ascii="Aptos" w:hAnsi="Aptos"/>
+                <w:lang w:val="es-MX"/>
+              </w:rPr>
+              <w:t>8 semanas (actividad intensiva en semanas 1-2 y 7-8)</w:t>
+            </w:r>
+          </w:p>
+        </w:tc>
+      </w:tr>
+      <w:tr>
+        <w:trPr>
+          <w:trHeight w:val="318"/>
+          <w:jc w:val="center"/>
+        </w:trPr>
+        <w:tc>
+          <w:tcPr>
+            <w:tcW w:w="3829" w:type="dxa"/>
+            <w:vAlign w:val="center"/>
+          </w:tcPr>
+          <w:p>
+            <w:pPr>
+              <w:rPr>
+                <w:rFonts w:ascii="Aptos" w:hAnsi="Aptos"/>
+                <w:lang w:val="es-MX"/>
+              </w:rPr>
+            </w:pPr>
+            <w:r>
+              <w:rPr>
+                <w:rFonts w:ascii="Aptos" w:hAnsi="Aptos"/>
+                <w:b/>
+                <w:bCs/>
+                <w:lang w:val="es-MX"/>
+              </w:rPr>
+              <w:t>Leslie Miroslava Benítez Marín</w:t>
+            </w:r>
+            <w:r>
+              <w:rPr>
+                <w:rFonts w:ascii="Aptos" w:hAnsi="Aptos"/>
+                <w:lang w:val="es-MX"/>
+              </w:rPr>
+              <w:t xml:space="preserve"> Desarrolladora Frontend. Responsable del diseño visual, maquetación de las secciones del portafolio, implementación de la galería de renders, efectos visuales, diseño responsivo y experiencia de usuario.</w:t>
+            </w:r>
+          </w:p>
+        </w:tc>
+        <w:tc>
+          <w:tcPr>
+            <w:tcW w:w="2771" w:type="dxa"/>
+            <w:vAlign w:val="center"/>
+          </w:tcPr>
+          <w:p>
+            <w:pPr>
+              <w:rPr>
+                <w:rFonts w:ascii="Aptos" w:hAnsi="Aptos"/>
+                <w:lang w:val="es-MX"/>
+              </w:rPr>
+            </w:pPr>
+            <w:r>
+              <w:rPr>
+                <w:rFonts w:ascii="Aptos" w:hAnsi="Aptos"/>
+                <w:lang w:val="es-MX"/>
+              </w:rPr>
+              <w:t>Principalmente durante el Sprint 2 y Sprint 3 (semanas 3-6) para el desarrollo de la interfaz visual, la galería de proyectos, el catálogo de servicios y los ajustes de diseño responsivo. Disponible para soporte en los demás Sprints.</w:t>
+            </w:r>
+          </w:p>
+        </w:tc>
+        <w:tc>
+          <w:tcPr>
+            <w:tcW w:w="2750" w:type="dxa"/>
+            <w:vAlign w:val="center"/>
+          </w:tcPr>
+          <w:p>
+            <w:pPr>
+              <w:rPr>
+                <w:rFonts w:ascii="Aptos" w:hAnsi="Aptos"/>
+                <w:lang w:val="es-MX"/>
+              </w:rPr>
+            </w:pPr>
+            <w:r>
+              <w:rPr>
+                <w:rFonts w:ascii="Aptos" w:hAnsi="Aptos"/>
+                <w:lang w:val="es-MX"/>
+              </w:rPr>
+              <w:t>8 semanas (actividad intensiva en semanas 3-6)</w:t>
+            </w:r>
+          </w:p>
+        </w:tc>
+      </w:tr>
+      <w:tr>
+        <w:trPr>
+          <w:trHeight w:val="318"/>
+          <w:jc w:val="center"/>
+        </w:trPr>
+        <w:tc>
+          <w:tcPr>
+            <w:tcW w:w="3829" w:type="dxa"/>
+            <w:vAlign w:val="center"/>
+          </w:tcPr>
+          <w:p>
+            <w:pPr>
+              <w:rPr>
+                <w:rFonts w:ascii="Aptos" w:hAnsi="Aptos"/>
+                <w:lang w:val="es-MX"/>
+              </w:rPr>
+            </w:pPr>
+            <w:r>
+              <w:rPr>
+                <w:rFonts w:ascii="Aptos" w:hAnsi="Aptos"/>
+                <w:b/>
+                <w:bCs/>
+                <w:lang w:val="es-MX"/>
+              </w:rPr>
+              <w:t>María Fernanda Barrón Álvarez</w:t>
+            </w:r>
+            <w:r>
+              <w:rPr>
+                <w:rFonts w:ascii="Aptos" w:hAnsi="Aptos"/>
+                <w:lang w:val="es-MX"/>
+              </w:rPr>
+              <w:t xml:space="preserve"> Project Manager. Responsable de la supervisión general del proyecto, coordinación del equipo, comunicación directa con el arquitecto freelancer (stakeholder), recopilación de retroalimentación y aseguramiento de que los entregables cumplan con los objetivos planteados.</w:t>
+            </w:r>
+          </w:p>
+        </w:tc>
+        <w:tc>
+          <w:tcPr>
+            <w:tcW w:w="2771" w:type="dxa"/>
+            <w:vAlign w:val="center"/>
+          </w:tcPr>
+          <w:p>
+            <w:pPr>
+              <w:rPr>
+                <w:rFonts w:ascii="Aptos" w:hAnsi="Aptos"/>
+                <w:lang w:val="es-MX"/>
+              </w:rPr>
+            </w:pPr>
+            <w:r>
+              <w:rPr>
+                <w:rFonts w:ascii="Aptos" w:hAnsi="Aptos"/>
+                <w:lang w:val="es-MX"/>
+              </w:rPr>
+              <w:t>Durante las 8 semanas completas del desarrollo. Su participación es constante ya que debe supervisar cada Sprint, gestionar la comunicación con el cliente y asegurar que la retroalimentación se incorpore oportunamente.</w:t>
+            </w:r>
+          </w:p>
+        </w:tc>
+        <w:tc>
+          <w:tcPr>
+            <w:tcW w:w="2750" w:type="dxa"/>
+            <w:vAlign w:val="center"/>
+          </w:tcPr>
+          <w:p>
+            <w:pPr>
+              <w:rPr>
+                <w:rFonts w:ascii="Aptos" w:hAnsi="Aptos"/>
+                <w:lang w:val="es-MX"/>
+              </w:rPr>
+            </w:pPr>
+            <w:r>
+              <w:rPr>
+                <w:rFonts w:ascii="Aptos" w:hAnsi="Aptos"/>
+                <w:lang w:val="es-MX"/>
+              </w:rPr>
+              <w:t>8 semanas (actividad constante)</w:t>
+            </w:r>
+          </w:p>
+        </w:tc>
+      </w:tr>
+    </w:tbl>
+    <w:p>
+      <w:pPr>
+        <w:pStyle w:val="Ttulo3"/>
+        <w:rPr>
+          <w:rFonts w:ascii="Aptos" w:hAnsi="Aptos"/>
+          <w:b/>
+          <w:bCs/>
+          <w:color w:val="auto"/>
+          <w:sz w:val="24"/>
+          <w:szCs w:val="24"/>
+          <w:lang w:val="es-MX"/>
+        </w:rPr>
+      </w:pPr>
+      <w:bookmarkStart w:id="6" w:name="_Toc224107861"/>
+      <w:r>
+        <w:rPr>
+          <w:rFonts w:ascii="Aptos" w:hAnsi="Aptos"/>
+          <w:b/>
+          <w:bCs/>
+          <w:color w:val="auto"/>
+          <w:sz w:val="24"/>
+          <w:szCs w:val="24"/>
+          <w:lang w:val="es-MX"/>
+        </w:rPr>
+        <w:lastRenderedPageBreak/>
+        <w:t>Reporte de disponibilidad</w:t>
+      </w:r>
+      <w:bookmarkEnd w:id="6"/>
+    </w:p>
+    <w:p>
+      <w:pPr>
+        <w:jc w:val="both"/>
+        <w:rPr>
+          <w:rFonts w:ascii="Aptos" w:hAnsi="Aptos"/>
+          <w:lang w:val="es-MX"/>
+        </w:rPr>
+      </w:pPr>
+      <w:r>
+        <w:rPr>
+          <w:rFonts w:ascii="Aptos" w:hAnsi="Aptos"/>
+          <w:lang w:val="es-MX"/>
+        </w:rPr>
+        <w:t>Reporte de disponibilidad: Los tres integrantes del equipo son estudiantes de Ingeniería en Computación Inteligente y cuentan con disponibilidad durante todo el semestre. La distribución de roles permite que la carga de trabajo sea equilibrada a lo largo del proyecto, evitando cuellos de botella. En caso de requerir apoyo adicional en alguna fase, cualquier miembro del equipo puede colaborar fuera de su periodo de mayor actividad.</w:t>
+      </w:r>
+    </w:p>
+    <w:p>
+      <w:pPr>
+        <w:jc w:val="both"/>
+        <w:rPr>
+          <w:rFonts w:ascii="Aptos" w:hAnsi="Aptos"/>
+          <w:lang w:val="es-MX"/>
+        </w:rPr>
+      </w:pPr>
+    </w:p>
+    <w:p>
+      <w:pPr>
+        <w:pStyle w:val="titulo1"/>
+        <w:outlineLvl w:val="1"/>
+        <w:rPr>
+          <w:rFonts w:ascii="Aptos" w:hAnsi="Aptos"/>
+        </w:rPr>
+      </w:pPr>
+      <w:bookmarkStart w:id="7" w:name="_Toc224107862"/>
+      <w:r>
+        <w:rPr>
+          <w:rFonts w:ascii="Aptos" w:hAnsi="Aptos"/>
+        </w:rPr>
+        <w:t>Recursos de software utilizables</w:t>
+      </w:r>
+      <w:bookmarkEnd w:id="7"/>
+    </w:p>
+    <w:p>
+      <w:pPr>
+        <w:rPr>
+          <w:lang w:val="es-MX" w:eastAsia="zh-CN"/>
+        </w:rPr>
+      </w:pPr>
+      <w:r>
+        <w:rPr>
+          <w:lang w:val="es-MX" w:eastAsia="zh-CN"/>
+        </w:rPr>
+        <w:t>Para el desarrollo del portafolio se utilizarán tecnologías web estándar y herramientas de software libre que no generan costos de licenciamiento.</w:t>
+      </w:r>
+    </w:p>
+    <w:p>
+      <w:pPr>
+        <w:rPr>
+          <w:lang w:val="es-MX" w:eastAsia="zh-CN"/>
+        </w:rPr>
+      </w:pPr>
+    </w:p>
+    <w:tbl>
+      <w:tblPr>
+        <w:tblStyle w:val="Tablaconcuadrcula"/>
+        <w:tblW w:w="0" w:type="auto"/>
+        <w:jc w:val="center"/>
+        <w:tblBorders>
+          <w:top w:val="single" w:sz="4" w:space="0" w:color="595959" w:themeColor="text1" w:themeTint="A6"/>
+          <w:left w:val="single" w:sz="4" w:space="0" w:color="595959" w:themeColor="text1" w:themeTint="A6"/>
+          <w:bottom w:val="single" w:sz="4" w:space="0" w:color="595959" w:themeColor="text1" w:themeTint="A6"/>
+          <w:right w:val="single" w:sz="4" w:space="0" w:color="595959" w:themeColor="text1" w:themeTint="A6"/>
+          <w:insideH w:val="single" w:sz="4" w:space="0" w:color="595959" w:themeColor="text1" w:themeTint="A6"/>
+          <w:insideV w:val="single" w:sz="4" w:space="0" w:color="595959" w:themeColor="text1" w:themeTint="A6"/>
+        </w:tblBorders>
+        <w:tblCellMar>
+          <w:top w:w="57" w:type="dxa"/>
+          <w:bottom w:w="57" w:type="dxa"/>
+        </w:tblCellMar>
+        <w:tblLook w:val="04A0" w:firstRow="1" w:lastRow="0" w:firstColumn="1" w:lastColumn="0" w:noHBand="0" w:noVBand="1"/>
+      </w:tblPr>
+      <w:tblGrid>
+        <w:gridCol w:w="3819"/>
+        <w:gridCol w:w="2795"/>
+        <w:gridCol w:w="2736"/>
+      </w:tblGrid>
+      <w:tr>
+        <w:trPr>
+          <w:trHeight w:val="620"/>
+          <w:jc w:val="center"/>
+        </w:trPr>
+        <w:tc>
+          <w:tcPr>
+            <w:tcW w:w="4067" w:type="dxa"/>
+            <w:shd w:val="clear" w:color="auto" w:fill="262626" w:themeFill="text1" w:themeFillTint="D9"/>
+            <w:vAlign w:val="center"/>
+          </w:tcPr>
+          <w:p>
+            <w:pPr>
+              <w:pStyle w:val="Ttulo3"/>
+              <w:spacing w:before="0" w:after="0"/>
+              <w:jc w:val="center"/>
+              <w:rPr>
+                <w:rFonts w:ascii="Aptos" w:hAnsi="Aptos"/>
+                <w:b/>
+                <w:bCs/>
+                <w:color w:val="auto"/>
+                <w:sz w:val="24"/>
+                <w:szCs w:val="24"/>
+                <w:lang w:val="es-MX"/>
+              </w:rPr>
+            </w:pPr>
+            <w:bookmarkStart w:id="8" w:name="_Toc224107863"/>
+            <w:r>
+              <w:rPr>
+                <w:rFonts w:ascii="Aptos" w:hAnsi="Aptos"/>
+                <w:b/>
+                <w:bCs/>
+                <w:color w:val="auto"/>
+                <w:sz w:val="24"/>
+                <w:szCs w:val="24"/>
+                <w:lang w:val="es-MX"/>
+              </w:rPr>
+              <w:t>Descripción</w:t>
+            </w:r>
+            <w:bookmarkEnd w:id="8"/>
+          </w:p>
+        </w:tc>
+        <w:tc>
+          <w:tcPr>
+            <w:tcW w:w="2928" w:type="dxa"/>
+            <w:shd w:val="clear" w:color="auto" w:fill="262626" w:themeFill="text1" w:themeFillTint="D9"/>
+            <w:vAlign w:val="center"/>
+          </w:tcPr>
+          <w:p>
+            <w:pPr>
+              <w:pStyle w:val="Ttulo3"/>
+              <w:spacing w:before="0" w:after="0"/>
+              <w:jc w:val="center"/>
+              <w:rPr>
+                <w:rFonts w:ascii="Aptos" w:hAnsi="Aptos"/>
+                <w:b/>
+                <w:bCs/>
+                <w:color w:val="auto"/>
+                <w:sz w:val="24"/>
+                <w:szCs w:val="24"/>
+                <w:lang w:val="es-MX"/>
+              </w:rPr>
+            </w:pPr>
+            <w:bookmarkStart w:id="9" w:name="_Toc224107864"/>
+            <w:r>
+              <w:rPr>
+                <w:rFonts w:ascii="Aptos" w:hAnsi="Aptos"/>
+                <w:b/>
+                <w:bCs/>
+                <w:color w:val="auto"/>
+                <w:sz w:val="24"/>
+                <w:szCs w:val="24"/>
+                <w:lang w:val="es-MX"/>
+              </w:rPr>
+              <w:t>¿Cuándo se requiere?</w:t>
+            </w:r>
+            <w:bookmarkEnd w:id="9"/>
+          </w:p>
+        </w:tc>
+        <w:tc>
+          <w:tcPr>
+            <w:tcW w:w="2929" w:type="dxa"/>
+            <w:shd w:val="clear" w:color="auto" w:fill="262626" w:themeFill="text1" w:themeFillTint="D9"/>
+            <w:vAlign w:val="center"/>
+          </w:tcPr>
+          <w:p>
+            <w:pPr>
+              <w:pStyle w:val="Ttulo3"/>
+              <w:spacing w:before="0" w:after="0"/>
+              <w:jc w:val="center"/>
+              <w:rPr>
+                <w:rFonts w:ascii="Aptos" w:hAnsi="Aptos"/>
+                <w:b/>
+                <w:bCs/>
+                <w:color w:val="auto"/>
+                <w:sz w:val="24"/>
+                <w:szCs w:val="24"/>
+                <w:lang w:val="es-MX"/>
+              </w:rPr>
+            </w:pPr>
+            <w:bookmarkStart w:id="10" w:name="_Toc224107865"/>
+            <w:r>
+              <w:rPr>
+                <w:rFonts w:ascii="Aptos" w:hAnsi="Aptos"/>
+                <w:b/>
+                <w:bCs/>
+                <w:color w:val="auto"/>
+                <w:sz w:val="24"/>
+                <w:szCs w:val="24"/>
+                <w:lang w:val="es-MX"/>
+              </w:rPr>
+              <w:t>Tiempo</w:t>
+            </w:r>
+            <w:bookmarkEnd w:id="10"/>
+          </w:p>
+        </w:tc>
+      </w:tr>
+      <w:tr>
+        <w:trPr>
+          <w:trHeight w:val="318"/>
+          <w:jc w:val="center"/>
+        </w:trPr>
+        <w:tc>
+          <w:tcPr>
+            <w:tcW w:w="4067" w:type="dxa"/>
+            <w:vAlign w:val="center"/>
+          </w:tcPr>
+          <w:p>
+            <w:pPr>
+              <w:rPr>
+                <w:rFonts w:ascii="Aptos" w:hAnsi="Aptos"/>
+                <w:lang w:val="es-MX"/>
+              </w:rPr>
+            </w:pPr>
+            <w:r>
+              <w:rPr>
+                <w:rFonts w:ascii="Aptos" w:hAnsi="Aptos"/>
+                <w:b/>
+                <w:bCs/>
+                <w:lang w:val="es-MX"/>
+              </w:rPr>
+              <w:t xml:space="preserve">HTML5, CSS3, JavaScript </w:t>
+            </w:r>
+            <w:r>
+              <w:rPr>
+                <w:rFonts w:ascii="Aptos" w:hAnsi="Aptos"/>
+                <w:lang w:val="es-MX"/>
+              </w:rPr>
+              <w:t>(vanilla). Lenguajes base para la estructura, diseño y funcionalidad del sitio web.</w:t>
+            </w:r>
+          </w:p>
+          <w:p>
+            <w:pPr>
+              <w:rPr>
+                <w:rFonts w:ascii="Aptos" w:hAnsi="Aptos"/>
+                <w:lang w:val="es-MX"/>
+              </w:rPr>
+            </w:pPr>
+          </w:p>
+          <w:p>
+            <w:pPr>
+              <w:rPr>
+                <w:rFonts w:ascii="Aptos" w:hAnsi="Aptos"/>
+                <w:lang w:val="es-MX"/>
+              </w:rPr>
+            </w:pPr>
+            <w:r>
+              <w:rPr>
+                <w:rFonts w:ascii="Aptos" w:hAnsi="Aptos"/>
+                <w:lang w:val="es-MX"/>
+              </w:rPr>
+              <w:t>No se emplearán frameworks, lo que reduce la complejidad y las dependencias externas.</w:t>
+            </w:r>
+          </w:p>
+        </w:tc>
+        <w:tc>
+          <w:tcPr>
+            <w:tcW w:w="2928" w:type="dxa"/>
+            <w:vAlign w:val="center"/>
+          </w:tcPr>
+          <w:p>
+            <w:pPr>
+              <w:spacing w:after="240"/>
+              <w:rPr>
+                <w:lang w:val="es-MX"/>
+              </w:rPr>
+            </w:pPr>
+            <w:r>
+              <w:rPr>
+                <w:rFonts w:ascii="Aptos" w:eastAsia="Aptos" w:hAnsi="Aptos" w:cs="Aptos"/>
+                <w:lang w:val="es-MX"/>
+              </w:rPr>
+              <w:t>Desde el inicio del desarrollo (Sprint 1) y durante todo el proyecto. HTML y CSS se utilizan desde la estructura base; JavaScript se incorpora a partir del Sprint 2 para efectos visuales e interactividad.</w:t>
+            </w:r>
+          </w:p>
           <w:p>
             <w:pPr>
               <w:rPr>
@@ -1843,6 +2972,377 @@
                 <w:lang w:val="es-MX"/>
               </w:rPr>
             </w:pPr>
+            <w:r>
+              <w:rPr>
+                <w:rFonts w:ascii="Aptos" w:hAnsi="Aptos"/>
+                <w:lang w:val="es-MX"/>
+              </w:rPr>
+              <w:t>8 semanas</w:t>
+            </w:r>
+          </w:p>
+        </w:tc>
+      </w:tr>
+      <w:tr>
+        <w:trPr>
+          <w:trHeight w:val="318"/>
+          <w:jc w:val="center"/>
+        </w:trPr>
+        <w:tc>
+          <w:tcPr>
+            <w:tcW w:w="3829" w:type="dxa"/>
+            <w:vAlign w:val="center"/>
+          </w:tcPr>
+          <w:p>
+            <w:pPr>
+              <w:rPr>
+                <w:rFonts w:ascii="Aptos" w:hAnsi="Aptos"/>
+                <w:lang w:val="es-MX"/>
+              </w:rPr>
+            </w:pPr>
+            <w:r>
+              <w:rPr>
+                <w:rFonts w:ascii="Aptos" w:hAnsi="Aptos"/>
+                <w:b/>
+                <w:bCs/>
+                <w:lang w:val="es-MX"/>
+              </w:rPr>
+              <w:t>Visual Studio Code</w:t>
+            </w:r>
+            <w:r>
+              <w:rPr>
+                <w:rFonts w:ascii="Aptos" w:hAnsi="Aptos"/>
+                <w:lang w:val="es-MX"/>
+              </w:rPr>
+              <w:t xml:space="preserve">. </w:t>
+            </w:r>
+          </w:p>
+          <w:p>
+            <w:pPr>
+              <w:rPr>
+                <w:rFonts w:ascii="Aptos" w:hAnsi="Aptos"/>
+                <w:lang w:val="es-MX"/>
+              </w:rPr>
+            </w:pPr>
+            <w:r>
+              <w:rPr>
+                <w:rFonts w:ascii="Aptos" w:hAnsi="Aptos"/>
+                <w:lang w:val="es-MX"/>
+              </w:rPr>
+              <w:t>Editor de código gratuito utilizado por todo el equipo para la escritura y edición del código fuente.</w:t>
+            </w:r>
+          </w:p>
+        </w:tc>
+        <w:tc>
+          <w:tcPr>
+            <w:tcW w:w="2771" w:type="dxa"/>
+            <w:vAlign w:val="center"/>
+          </w:tcPr>
+          <w:p>
+            <w:pPr>
+              <w:rPr>
+                <w:rFonts w:ascii="Aptos" w:eastAsia="Aptos" w:hAnsi="Aptos" w:cs="Aptos"/>
+                <w:lang w:val="es-MX"/>
+              </w:rPr>
+            </w:pPr>
+            <w:r>
+              <w:rPr>
+                <w:rFonts w:ascii="Aptos" w:eastAsia="Aptos" w:hAnsi="Aptos" w:cs="Aptos"/>
+                <w:lang w:val="es-MX"/>
+              </w:rPr>
+              <w:t>Desde el Sprint 1 hasta el cierre del proyecto.</w:t>
+            </w:r>
+          </w:p>
+        </w:tc>
+        <w:tc>
+          <w:tcPr>
+            <w:tcW w:w="2750" w:type="dxa"/>
+            <w:vAlign w:val="center"/>
+          </w:tcPr>
+          <w:p>
+            <w:pPr>
+              <w:rPr>
+                <w:rFonts w:ascii="Aptos" w:hAnsi="Aptos"/>
+                <w:lang w:val="es-MX"/>
+              </w:rPr>
+            </w:pPr>
+            <w:r>
+              <w:rPr>
+                <w:rFonts w:ascii="Aptos" w:hAnsi="Aptos"/>
+                <w:lang w:val="es-MX"/>
+              </w:rPr>
+              <w:t>8 semanas</w:t>
+            </w:r>
+          </w:p>
+        </w:tc>
+      </w:tr>
+      <w:tr>
+        <w:trPr>
+          <w:trHeight w:val="318"/>
+          <w:jc w:val="center"/>
+        </w:trPr>
+        <w:tc>
+          <w:tcPr>
+            <w:tcW w:w="3829" w:type="dxa"/>
+            <w:vAlign w:val="center"/>
+          </w:tcPr>
+          <w:p>
+            <w:pPr>
+              <w:rPr>
+                <w:rFonts w:ascii="Aptos" w:hAnsi="Aptos"/>
+                <w:lang w:val="es-MX"/>
+              </w:rPr>
+            </w:pPr>
+            <w:r>
+              <w:rPr>
+                <w:rFonts w:ascii="Aptos" w:hAnsi="Aptos"/>
+                <w:b/>
+                <w:bCs/>
+                <w:lang w:val="es-MX"/>
+              </w:rPr>
+              <w:t>GitHub</w:t>
+            </w:r>
+            <w:r>
+              <w:rPr>
+                <w:rFonts w:ascii="Aptos" w:hAnsi="Aptos"/>
+                <w:lang w:val="es-MX"/>
+              </w:rPr>
+              <w:t xml:space="preserve">. </w:t>
+            </w:r>
+          </w:p>
+          <w:p>
+            <w:pPr>
+              <w:rPr>
+                <w:rFonts w:ascii="Aptos" w:hAnsi="Aptos"/>
+                <w:lang w:val="es-MX"/>
+              </w:rPr>
+            </w:pPr>
+            <w:r>
+              <w:rPr>
+                <w:rFonts w:ascii="Aptos" w:hAnsi="Aptos"/>
+                <w:lang w:val="es-MX"/>
+              </w:rPr>
+              <w:t>Plataforma de control de versiones utilizada para la gestión colaborativa del código, seguimiento de cambios y respaldo del proyecto.</w:t>
+            </w:r>
+          </w:p>
+        </w:tc>
+        <w:tc>
+          <w:tcPr>
+            <w:tcW w:w="2771" w:type="dxa"/>
+            <w:vAlign w:val="center"/>
+          </w:tcPr>
+          <w:p>
+            <w:pPr>
+              <w:rPr>
+                <w:rFonts w:ascii="Aptos" w:eastAsia="Aptos" w:hAnsi="Aptos" w:cs="Aptos"/>
+                <w:lang w:val="es-MX"/>
+              </w:rPr>
+            </w:pPr>
+            <w:r>
+              <w:rPr>
+                <w:rFonts w:ascii="Aptos" w:eastAsia="Aptos" w:hAnsi="Aptos" w:cs="Aptos"/>
+                <w:lang w:val="es-MX"/>
+              </w:rPr>
+              <w:t>Desde el Sprint 1 hasta el cierre del proyecto. Es fundamental para la coordinación entre el desarrollador backend y la desarrolladora frontend.</w:t>
+            </w:r>
+          </w:p>
+        </w:tc>
+        <w:tc>
+          <w:tcPr>
+            <w:tcW w:w="2750" w:type="dxa"/>
+            <w:vAlign w:val="center"/>
+          </w:tcPr>
+          <w:p>
+            <w:pPr>
+              <w:rPr>
+                <w:rFonts w:ascii="Aptos" w:hAnsi="Aptos"/>
+                <w:lang w:val="es-MX"/>
+              </w:rPr>
+            </w:pPr>
+            <w:r>
+              <w:rPr>
+                <w:rFonts w:ascii="Aptos" w:hAnsi="Aptos"/>
+                <w:lang w:val="es-MX"/>
+              </w:rPr>
+              <w:t>8 semanas</w:t>
+            </w:r>
+          </w:p>
+        </w:tc>
+      </w:tr>
+      <w:tr>
+        <w:trPr>
+          <w:trHeight w:val="318"/>
+          <w:jc w:val="center"/>
+        </w:trPr>
+        <w:tc>
+          <w:tcPr>
+            <w:tcW w:w="3829" w:type="dxa"/>
+            <w:vAlign w:val="center"/>
+          </w:tcPr>
+          <w:p>
+            <w:pPr>
+              <w:rPr>
+                <w:rFonts w:ascii="Aptos" w:hAnsi="Aptos"/>
+                <w:lang w:val="es-MX"/>
+              </w:rPr>
+            </w:pPr>
+            <w:r>
+              <w:rPr>
+                <w:rFonts w:ascii="Aptos" w:hAnsi="Aptos"/>
+                <w:lang w:val="es-MX"/>
+              </w:rPr>
+              <w:t xml:space="preserve">Herramientas de optimización de imágenes (por ejemplo, TinyPNG, Squoosh). </w:t>
+            </w:r>
+          </w:p>
+          <w:p>
+            <w:pPr>
+              <w:rPr>
+                <w:rFonts w:ascii="Aptos" w:hAnsi="Aptos"/>
+                <w:lang w:val="es-MX"/>
+              </w:rPr>
+            </w:pPr>
+            <w:r>
+              <w:rPr>
+                <w:rFonts w:ascii="Aptos" w:hAnsi="Aptos"/>
+                <w:lang w:val="es-MX"/>
+              </w:rPr>
+              <w:t>Utilizadas para comprimir y optimizar los renders 3D sin perder calidad visual, garantizando tiempos de carga rápidos.</w:t>
+            </w:r>
+          </w:p>
+        </w:tc>
+        <w:tc>
+          <w:tcPr>
+            <w:tcW w:w="2771" w:type="dxa"/>
+            <w:vAlign w:val="center"/>
+          </w:tcPr>
+          <w:p>
+            <w:pPr>
+              <w:rPr>
+                <w:rFonts w:ascii="Aptos" w:eastAsia="Aptos" w:hAnsi="Aptos" w:cs="Aptos"/>
+                <w:lang w:val="es-MX"/>
+              </w:rPr>
+            </w:pPr>
+            <w:r>
+              <w:rPr>
+                <w:rFonts w:ascii="Aptos" w:eastAsia="Aptos" w:hAnsi="Aptos" w:cs="Aptos"/>
+                <w:lang w:val="es-MX"/>
+              </w:rPr>
+              <w:t>Principalmente durante los Sprints 2 y 3, al momento de integrar las imágenes de renders y proyectos al portafolio.</w:t>
+            </w:r>
+          </w:p>
+        </w:tc>
+        <w:tc>
+          <w:tcPr>
+            <w:tcW w:w="2750" w:type="dxa"/>
+            <w:vAlign w:val="center"/>
+          </w:tcPr>
+          <w:p>
+            <w:pPr>
+              <w:rPr>
+                <w:rFonts w:ascii="Aptos" w:hAnsi="Aptos"/>
+                <w:lang w:val="es-MX"/>
+              </w:rPr>
+            </w:pPr>
+            <w:r>
+              <w:rPr>
+                <w:rFonts w:ascii="Aptos" w:hAnsi="Aptos"/>
+                <w:lang w:val="es-MX"/>
+              </w:rPr>
+              <w:t>Semanas 3-6</w:t>
+            </w:r>
+          </w:p>
+        </w:tc>
+      </w:tr>
+      <w:tr>
+        <w:trPr>
+          <w:trHeight w:val="318"/>
+          <w:jc w:val="center"/>
+        </w:trPr>
+        <w:tc>
+          <w:tcPr>
+            <w:tcW w:w="3829" w:type="dxa"/>
+            <w:vAlign w:val="center"/>
+          </w:tcPr>
+          <w:p>
+            <w:pPr>
+              <w:rPr>
+                <w:rFonts w:ascii="Aptos" w:hAnsi="Aptos"/>
+                <w:lang w:val="en-US"/>
+              </w:rPr>
+            </w:pPr>
+            <w:r>
+              <w:rPr>
+                <w:rFonts w:ascii="Aptos" w:hAnsi="Aptos"/>
+                <w:b/>
+                <w:bCs/>
+                <w:lang w:val="en-US"/>
+              </w:rPr>
+              <w:lastRenderedPageBreak/>
+              <w:t xml:space="preserve">Navegadores web </w:t>
+            </w:r>
+            <w:r>
+              <w:rPr>
+                <w:rFonts w:ascii="Aptos" w:hAnsi="Aptos"/>
+                <w:lang w:val="en-US"/>
+              </w:rPr>
+              <w:t xml:space="preserve">(Chrome, Firefox, Safari). </w:t>
+            </w:r>
+          </w:p>
+          <w:p>
+            <w:pPr>
+              <w:rPr>
+                <w:rFonts w:ascii="Aptos" w:hAnsi="Aptos"/>
+                <w:lang w:val="es-MX"/>
+              </w:rPr>
+            </w:pPr>
+            <w:r>
+              <w:rPr>
+                <w:rFonts w:ascii="Aptos" w:hAnsi="Aptos"/>
+                <w:lang w:val="es-MX"/>
+              </w:rPr>
+              <w:t>Utilizados para pruebas de compatibilidad, diseño responsivo y depuración durante el desarrollo.</w:t>
+            </w:r>
+          </w:p>
+        </w:tc>
+        <w:tc>
+          <w:tcPr>
+            <w:tcW w:w="2771" w:type="dxa"/>
+            <w:vAlign w:val="center"/>
+          </w:tcPr>
+          <w:p>
+            <w:pPr>
+              <w:rPr>
+                <w:rFonts w:ascii="Aptos" w:eastAsia="Aptos" w:hAnsi="Aptos" w:cs="Aptos"/>
+                <w:lang w:val="es-MX"/>
+              </w:rPr>
+            </w:pPr>
+            <w:r>
+              <w:rPr>
+                <w:rFonts w:ascii="Aptos" w:eastAsia="Aptos" w:hAnsi="Aptos" w:cs="Aptos"/>
+                <w:lang w:val="es-MX"/>
+              </w:rPr>
+              <w:t>Durante todo el desarrollo, con mayor intensidad en las fases de pruebas (Sprints 3 y 4).</w:t>
+            </w:r>
+          </w:p>
+        </w:tc>
+        <w:tc>
+          <w:tcPr>
+            <w:tcW w:w="2750" w:type="dxa"/>
+            <w:vAlign w:val="center"/>
+          </w:tcPr>
+          <w:p>
+            <w:pPr>
+              <w:rPr>
+                <w:rFonts w:ascii="Aptos" w:hAnsi="Aptos"/>
+                <w:lang w:val="es-MX"/>
+              </w:rPr>
+            </w:pPr>
+            <w:r>
+              <w:rPr>
+                <w:rFonts w:ascii="Aptos" w:hAnsi="Aptos"/>
+                <w:lang w:val="es-MX"/>
+              </w:rPr>
+              <w:t>8 Semanas</w:t>
+            </w:r>
           </w:p>
         </w:tc>
       </w:tr>
@@ -1860,7 +3360,7 @@
           <w:lang w:val="es-MX"/>
         </w:rPr>
       </w:pPr>
-      <w:bookmarkStart w:id="6" w:name="_Toc224024561"/>
+      <w:bookmarkStart w:id="11" w:name="_Toc224107866"/>
       <w:r>
         <w:rPr>
           <w:rFonts w:ascii="Aptos" w:hAnsi="Aptos"/>
@@ -1873,7 +3373,7 @@
         </w:rPr>
         <w:t>Reporte de disponibilidad</w:t>
       </w:r>
-      <w:bookmarkEnd w:id="6"/>
+      <w:bookmarkEnd w:id="11"/>
     </w:p>
     <w:p>
       <w:pPr>
@@ -1888,7 +3388,7 @@
           <w:rFonts w:ascii="Aptos" w:hAnsi="Aptos"/>
           <w:lang w:val="es-MX"/>
         </w:rPr>
-        <w:t>--</w:t>
+        <w:t>Todas las herramientas de software mencionadas son gratuitas, de código abierto o de uso libre, y se encuentran disponibles para descarga e instalación inmediata. No existen restricciones de licenciamiento que puedan afectar el desarrollo del proyecto. El equipo ya cuenta con experiencia previa en el uso de estas herramientas.</w:t>
       </w:r>
     </w:p>
     <w:p>
@@ -1908,14 +3408,14 @@
           <w:rFonts w:ascii="Aptos" w:hAnsi="Aptos"/>
         </w:rPr>
       </w:pPr>
-      <w:bookmarkStart w:id="7" w:name="_Toc224024562"/>
+      <w:bookmarkStart w:id="12" w:name="_Toc224107867"/>
       <w:r>
         <w:rPr>
           <w:rFonts w:ascii="Aptos" w:hAnsi="Aptos"/>
         </w:rPr>
-        <w:t>Recursos de software utilizables</w:t>
+        <w:t>Recursos del entorno</w:t>
       </w:r>
-      <w:bookmarkEnd w:id="7"/>
+      <w:bookmarkEnd w:id="12"/>
     </w:p>
     <w:p>
       <w:pPr>
@@ -1950,9 +3450,9 @@
         <w:tblLook w:val="04A0" w:firstRow="1" w:lastRow="0" w:firstColumn="1" w:lastColumn="0" w:noHBand="0" w:noVBand="1"/>
       </w:tblPr>
       <w:tblGrid>
-        <w:gridCol w:w="3829"/>
-        <w:gridCol w:w="2771"/>
-        <w:gridCol w:w="2750"/>
+        <w:gridCol w:w="3818"/>
+        <w:gridCol w:w="2769"/>
+        <w:gridCol w:w="2763"/>
       </w:tblGrid>
       <w:tr>
         <w:trPr>
@@ -1980,6 +3480,7 @@
                 <w:lang w:val="es-MX"/>
               </w:rPr>
             </w:pPr>
+            <w:bookmarkStart w:id="13" w:name="_Toc224107868"/>
             <w:r>
               <w:rPr>
                 <w:rFonts w:ascii="Aptos" w:hAnsi="Aptos"/>
@@ -1992,6 +3493,7 @@
               </w:rPr>
               <w:t>Descripción</w:t>
             </w:r>
+            <w:bookmarkEnd w:id="13"/>
           </w:p>
         </w:tc>
         <w:tc>
@@ -2015,6 +3517,7 @@
                 <w:lang w:val="es-MX"/>
               </w:rPr>
             </w:pPr>
+            <w:bookmarkStart w:id="14" w:name="_Toc224107869"/>
             <w:r>
               <w:rPr>
                 <w:rFonts w:ascii="Aptos" w:hAnsi="Aptos"/>
@@ -2027,6 +3530,7 @@
               </w:rPr>
               <w:t>¿Cuándo se requiere?</w:t>
             </w:r>
+            <w:bookmarkEnd w:id="14"/>
           </w:p>
         </w:tc>
         <w:tc>
@@ -2050,6 +3554,7 @@
                 <w:lang w:val="es-MX"/>
               </w:rPr>
             </w:pPr>
+            <w:bookmarkStart w:id="15" w:name="_Toc224107870"/>
             <w:r>
               <w:rPr>
                 <w:rFonts w:ascii="Aptos" w:hAnsi="Aptos"/>
@@ -2062,6 +3567,7 @@
               </w:rPr>
               <w:t>Tiempo</w:t>
             </w:r>
+            <w:bookmarkEnd w:id="15"/>
           </w:p>
         </w:tc>
       </w:tr>
@@ -2082,6 +3588,22 @@
                 <w:lang w:val="es-MX"/>
               </w:rPr>
             </w:pPr>
+            <w:r>
+              <w:rPr>
+                <w:rFonts w:ascii="Aptos" w:hAnsi="Aptos"/>
+                <w:b/>
+                <w:bCs/>
+                <w:lang w:val="es-MX"/>
+              </w:rPr>
+              <w:t xml:space="preserve">Laptops personales </w:t>
+            </w:r>
+            <w:r>
+              <w:rPr>
+                <w:rFonts w:ascii="Aptos" w:hAnsi="Aptos"/>
+                <w:lang w:val="es-MX"/>
+              </w:rPr>
+              <w:t>de los integrantes del equipo. Equipos de cómputo portátiles con capacidad suficiente para ejecutar editores de código, navegadores web y herramientas de diseño. Cada miembro del equipo trabaja desde su propio equipo.</w:t>
+            </w:r>
           </w:p>
         </w:tc>
         <w:tc>
@@ -2096,6 +3618,13 @@
                 <w:lang w:val="es-MX"/>
               </w:rPr>
             </w:pPr>
+            <w:r>
+              <w:rPr>
+                <w:rFonts w:ascii="Aptos" w:hAnsi="Aptos"/>
+                <w:lang w:val="es-MX"/>
+              </w:rPr>
+              <w:t>Desde el inicio del proyecto (Sprint 1) hasta el cierre (Sprint 4).</w:t>
+            </w:r>
           </w:p>
         </w:tc>
         <w:tc>
@@ -2110,10 +3639,290 @@
                 <w:lang w:val="es-MX"/>
               </w:rPr>
             </w:pPr>
+            <w:r>
+              <w:rPr>
+                <w:rFonts w:ascii="Aptos" w:hAnsi="Aptos"/>
+                <w:lang w:val="es-MX"/>
+              </w:rPr>
+              <w:t>8 semanas</w:t>
+            </w:r>
+          </w:p>
+        </w:tc>
+      </w:tr>
+      <w:tr>
+        <w:trPr>
+          <w:trHeight w:val="318"/>
+          <w:jc w:val="center"/>
+        </w:trPr>
+        <w:tc>
+          <w:tcPr>
+            <w:tcW w:w="3829" w:type="dxa"/>
+            <w:vAlign w:val="center"/>
+          </w:tcPr>
+          <w:p>
+            <w:pPr>
+              <w:rPr>
+                <w:rFonts w:ascii="Aptos" w:hAnsi="Aptos"/>
+                <w:lang w:val="es-MX"/>
+              </w:rPr>
+            </w:pPr>
+            <w:r>
+              <w:rPr>
+                <w:rFonts w:ascii="Aptos" w:hAnsi="Aptos"/>
+                <w:b/>
+                <w:bCs/>
+                <w:lang w:val="es-MX"/>
+              </w:rPr>
+              <w:t>Conexión a internet</w:t>
+            </w:r>
+            <w:r>
+              <w:rPr>
+                <w:rFonts w:ascii="Aptos" w:hAnsi="Aptos"/>
+                <w:lang w:val="es-MX"/>
+              </w:rPr>
+              <w:t xml:space="preserve">. Necesaria para el uso de GitHub, descarga de recursos, pruebas en línea, comunicación con el </w:t>
+            </w:r>
+            <w:r>
+              <w:rPr>
+                <w:rFonts w:ascii="Aptos" w:hAnsi="Aptos"/>
+                <w:i/>
+                <w:iCs/>
+                <w:lang w:val="es-MX"/>
+              </w:rPr>
+              <w:t>stakeholder</w:t>
+            </w:r>
+            <w:r>
+              <w:rPr>
+                <w:rFonts w:ascii="Aptos" w:hAnsi="Aptos"/>
+                <w:lang w:val="es-MX"/>
+              </w:rPr>
+              <w:t xml:space="preserve"> y despliegue del sitio.</w:t>
+            </w:r>
+          </w:p>
+        </w:tc>
+        <w:tc>
+          <w:tcPr>
+            <w:tcW w:w="2771" w:type="dxa"/>
+            <w:vAlign w:val="center"/>
+          </w:tcPr>
+          <w:p>
+            <w:pPr>
+              <w:rPr>
+                <w:rFonts w:ascii="Aptos" w:hAnsi="Aptos"/>
+                <w:lang w:val="es-MX"/>
+              </w:rPr>
+            </w:pPr>
+            <w:r>
+              <w:rPr>
+                <w:rFonts w:ascii="Aptos" w:hAnsi="Aptos"/>
+                <w:lang w:val="es-MX"/>
+              </w:rPr>
+              <w:t>Durante todo el desarrollo del proyecto</w:t>
+            </w:r>
+          </w:p>
+        </w:tc>
+        <w:tc>
+          <w:tcPr>
+            <w:tcW w:w="2750" w:type="dxa"/>
+            <w:vAlign w:val="center"/>
+          </w:tcPr>
+          <w:p>
+            <w:pPr>
+              <w:rPr>
+                <w:rFonts w:ascii="Aptos" w:hAnsi="Aptos"/>
+                <w:lang w:val="es-MX"/>
+              </w:rPr>
+            </w:pPr>
+            <w:r>
+              <w:rPr>
+                <w:rFonts w:ascii="Aptos" w:hAnsi="Aptos"/>
+                <w:lang w:val="es-MX"/>
+              </w:rPr>
+              <w:t>8 semanas</w:t>
+            </w:r>
+          </w:p>
+        </w:tc>
+      </w:tr>
+      <w:tr>
+        <w:trPr>
+          <w:trHeight w:val="318"/>
+          <w:jc w:val="center"/>
+        </w:trPr>
+        <w:tc>
+          <w:tcPr>
+            <w:tcW w:w="3829" w:type="dxa"/>
+            <w:vAlign w:val="center"/>
+          </w:tcPr>
+          <w:p>
+            <w:pPr>
+              <w:rPr>
+                <w:rFonts w:ascii="Aptos" w:hAnsi="Aptos"/>
+                <w:lang w:val="es-MX"/>
+              </w:rPr>
+            </w:pPr>
+            <w:r>
+              <w:rPr>
+                <w:rFonts w:ascii="Aptos" w:hAnsi="Aptos"/>
+                <w:b/>
+                <w:bCs/>
+                <w:lang w:val="es-MX"/>
+              </w:rPr>
+              <w:t xml:space="preserve">Servicio de hosting </w:t>
+            </w:r>
+            <w:r>
+              <w:rPr>
+                <w:rFonts w:ascii="Aptos" w:hAnsi="Aptos"/>
+                <w:lang w:val="es-MX"/>
+              </w:rPr>
+              <w:t>(Hostinger VPS). Servidor privado virtual contratado en Hostinger para alojar el portafolio digital. Se utilizará Nginx como servidor web en conjunto con Flask y Gunicorn para servir los archivos estáticos del sitio. Esta configuración ofrece un rendimiento estable, control sobre el entorno del servidor y capacidad de escalar si el proyecto lo requiere en el futuro. Contemplado dentro del presupuesto del proyecto ($1,000 MXN por el primer año).</w:t>
+            </w:r>
+          </w:p>
+        </w:tc>
+        <w:tc>
+          <w:tcPr>
+            <w:tcW w:w="2771" w:type="dxa"/>
+            <w:vAlign w:val="center"/>
+          </w:tcPr>
+          <w:p>
+            <w:pPr>
+              <w:rPr>
+                <w:rFonts w:ascii="Aptos" w:hAnsi="Aptos"/>
+                <w:lang w:val="es-MX"/>
+              </w:rPr>
+            </w:pPr>
+            <w:r>
+              <w:rPr>
+                <w:rFonts w:ascii="Aptos" w:hAnsi="Aptos"/>
+                <w:lang w:val="es-MX"/>
+              </w:rPr>
+              <w:t>Se requiere a partir del Sprint 4 (semanas 7-8) para el despliegue del sistema.</w:t>
+            </w:r>
+          </w:p>
+        </w:tc>
+        <w:tc>
+          <w:tcPr>
+            <w:tcW w:w="2750" w:type="dxa"/>
+            <w:vAlign w:val="center"/>
+          </w:tcPr>
+          <w:p>
+            <w:pPr>
+              <w:rPr>
+                <w:rFonts w:ascii="Aptos" w:hAnsi="Aptos"/>
+                <w:lang w:val="es-MX"/>
+              </w:rPr>
+            </w:pPr>
+            <w:r>
+              <w:rPr>
+                <w:rFonts w:ascii="Aptos" w:hAnsi="Aptos"/>
+                <w:lang w:val="es-MX"/>
+              </w:rPr>
+              <w:t>A partir de la semana 7, con renovación anual</w:t>
+            </w:r>
+          </w:p>
+        </w:tc>
+      </w:tr>
+      <w:tr>
+        <w:trPr>
+          <w:trHeight w:val="318"/>
+          <w:jc w:val="center"/>
+        </w:trPr>
+        <w:tc>
+          <w:tcPr>
+            <w:tcW w:w="3829" w:type="dxa"/>
+            <w:vAlign w:val="center"/>
+          </w:tcPr>
+          <w:p>
+            <w:pPr>
+              <w:rPr>
+                <w:rFonts w:ascii="Aptos" w:hAnsi="Aptos"/>
+                <w:lang w:val="es-MX"/>
+              </w:rPr>
+            </w:pPr>
+            <w:r>
+              <w:rPr>
+                <w:rFonts w:ascii="Aptos" w:hAnsi="Aptos"/>
+                <w:b/>
+                <w:bCs/>
+                <w:lang w:val="es-MX"/>
+              </w:rPr>
+              <w:lastRenderedPageBreak/>
+              <w:t>Dominio web</w:t>
+            </w:r>
+            <w:r>
+              <w:rPr>
+                <w:rFonts w:ascii="Aptos" w:hAnsi="Aptos"/>
+                <w:lang w:val="es-MX"/>
+              </w:rPr>
+              <w:t xml:space="preserve">. </w:t>
+            </w:r>
+          </w:p>
+          <w:p>
+            <w:pPr>
+              <w:rPr>
+                <w:rFonts w:ascii="Aptos" w:hAnsi="Aptos"/>
+                <w:lang w:val="es-MX"/>
+              </w:rPr>
+            </w:pPr>
+            <w:r>
+              <w:rPr>
+                <w:rFonts w:ascii="Aptos" w:hAnsi="Aptos"/>
+                <w:lang w:val="es-MX"/>
+              </w:rPr>
+              <w:t>Registro de un nombre de dominio personalizado para el portafolio del arquitecto. Contemplado dentro del presupuesto ($500 MXN por el primer año)</w:t>
+            </w:r>
+          </w:p>
+        </w:tc>
+        <w:tc>
+          <w:tcPr>
+            <w:tcW w:w="2771" w:type="dxa"/>
+            <w:vAlign w:val="center"/>
+          </w:tcPr>
+          <w:p>
+            <w:pPr>
+              <w:rPr>
+                <w:rFonts w:ascii="Aptos" w:hAnsi="Aptos"/>
+                <w:lang w:val="es-MX"/>
+              </w:rPr>
+            </w:pPr>
+            <w:r>
+              <w:rPr>
+                <w:rFonts w:ascii="Aptos" w:hAnsi="Aptos"/>
+                <w:lang w:val="es-MX"/>
+              </w:rPr>
+              <w:t>Se requiere a partir del Sprint 4 (semanas 7-8) para la publicación del sitio.</w:t>
+            </w:r>
+          </w:p>
+        </w:tc>
+        <w:tc>
+          <w:tcPr>
+            <w:tcW w:w="2750" w:type="dxa"/>
+            <w:vAlign w:val="center"/>
+          </w:tcPr>
+          <w:p>
+            <w:pPr>
+              <w:rPr>
+                <w:rFonts w:ascii="Aptos" w:hAnsi="Aptos"/>
+                <w:lang w:val="es-MX"/>
+              </w:rPr>
+            </w:pPr>
+            <w:r>
+              <w:rPr>
+                <w:rFonts w:ascii="Aptos" w:hAnsi="Aptos"/>
+                <w:lang w:val="es-MX"/>
+              </w:rPr>
+              <w:t>A partir de la semana 7, con renovación anual</w:t>
+            </w:r>
           </w:p>
         </w:tc>
       </w:tr>
     </w:tbl>
+    <w:p>
+      <w:pPr>
+        <w:rPr>
+          <w:lang w:val="es-MX"/>
+        </w:rPr>
+      </w:pPr>
+    </w:p>
     <w:p>
       <w:pPr>
         <w:pStyle w:val="Ttulo3"/>
@@ -2127,6 +3936,7 @@
           <w:lang w:val="es-MX"/>
         </w:rPr>
       </w:pPr>
+      <w:bookmarkStart w:id="16" w:name="_Toc224107871"/>
       <w:r>
         <w:rPr>
           <w:rFonts w:ascii="Aptos" w:hAnsi="Aptos"/>
@@ -2139,6 +3949,7 @@
         </w:rPr>
         <w:t>Reporte de disponibilidad</w:t>
       </w:r>
+      <w:bookmarkEnd w:id="16"/>
     </w:p>
     <w:p>
       <w:pPr>
@@ -2153,272 +3964,7 @@
           <w:rFonts w:ascii="Aptos" w:hAnsi="Aptos"/>
           <w:lang w:val="es-MX"/>
         </w:rPr>
-        <w:t>--</w:t>
-      </w:r>
-    </w:p>
-    <w:p>
-      <w:pPr>
-        <w:jc w:val="both"/>
-        <w:rPr>
-          <w:rFonts w:ascii="Aptos" w:hAnsi="Aptos"/>
-          <w:lang w:val="es-MX"/>
-        </w:rPr>
-      </w:pPr>
-    </w:p>
-    <w:p>
-      <w:pPr>
-        <w:pStyle w:val="titulo1"/>
-        <w:outlineLvl w:val="1"/>
-        <w:rPr>
-          <w:rFonts w:ascii="Aptos" w:hAnsi="Aptos"/>
-        </w:rPr>
-      </w:pPr>
-      <w:bookmarkStart w:id="8" w:name="_Toc224024563"/>
-      <w:r>
-        <w:rPr>
-          <w:rFonts w:ascii="Aptos" w:hAnsi="Aptos"/>
-        </w:rPr>
-        <w:t>Recursos del entorno</w:t>
-      </w:r>
-      <w:bookmarkEnd w:id="8"/>
-    </w:p>
-    <w:p>
-      <w:pPr>
-        <w:rPr>
-          <w:lang w:val="es-MX" w:eastAsia="zh-CN"/>
-        </w:rPr>
-      </w:pPr>
-      <w:r>
-        <w:rPr>
-          <w:lang w:val="es-MX" w:eastAsia="zh-CN"/>
-        </w:rPr>
-        <w:t>--</w:t>
-      </w:r>
-    </w:p>
-    <w:tbl>
-      <w:tblPr>
-        <w:tblStyle w:val="Tablaconcuadrcula"/>
-        <w:tblW w:w="0" w:type="auto"/>
-        <w:jc w:val="center"/>
-        <w:tblBorders>
-          <w:top w:val="single" w:sz="4" w:space="0" w:color="595959" w:themeColor="text1" w:themeTint="A6"/>
-          <w:left w:val="single" w:sz="4" w:space="0" w:color="595959" w:themeColor="text1" w:themeTint="A6"/>
-          <w:bottom w:val="single" w:sz="4" w:space="0" w:color="595959" w:themeColor="text1" w:themeTint="A6"/>
-          <w:right w:val="single" w:sz="4" w:space="0" w:color="595959" w:themeColor="text1" w:themeTint="A6"/>
-          <w:insideH w:val="single" w:sz="4" w:space="0" w:color="595959" w:themeColor="text1" w:themeTint="A6"/>
-          <w:insideV w:val="single" w:sz="4" w:space="0" w:color="595959" w:themeColor="text1" w:themeTint="A6"/>
-        </w:tblBorders>
-        <w:tblCellMar>
-          <w:top w:w="57" w:type="dxa"/>
-          <w:bottom w:w="57" w:type="dxa"/>
-        </w:tblCellMar>
-        <w:tblLook w:val="04A0" w:firstRow="1" w:lastRow="0" w:firstColumn="1" w:lastColumn="0" w:noHBand="0" w:noVBand="1"/>
-      </w:tblPr>
-      <w:tblGrid>
-        <w:gridCol w:w="3829"/>
-        <w:gridCol w:w="2771"/>
-        <w:gridCol w:w="2750"/>
-      </w:tblGrid>
-      <w:tr>
-        <w:trPr>
-          <w:trHeight w:val="620"/>
-          <w:jc w:val="center"/>
-        </w:trPr>
-        <w:tc>
-          <w:tcPr>
-            <w:tcW w:w="4067" w:type="dxa"/>
-            <w:shd w:val="clear" w:color="auto" w:fill="262626" w:themeFill="text1" w:themeFillTint="D9"/>
-            <w:vAlign w:val="center"/>
-          </w:tcPr>
-          <w:p>
-            <w:pPr>
-              <w:pStyle w:val="Ttulo3"/>
-              <w:spacing w:before="0" w:after="0"/>
-              <w:jc w:val="center"/>
-              <w:rPr>
-                <w:rFonts w:ascii="Aptos" w:hAnsi="Aptos"/>
-                <w:b/>
-                <w:bCs/>
-                <w:color w:val="auto"/>
-                <w:sz w:val="24"/>
-                <w:szCs w:val="24"/>
-                <w:lang w:val="es-MX"/>
-              </w:rPr>
-            </w:pPr>
-            <w:r>
-              <w:rPr>
-                <w:rFonts w:ascii="Aptos" w:hAnsi="Aptos"/>
-                <w:b/>
-                <w:bCs/>
-                <w:color w:val="auto"/>
-                <w:sz w:val="24"/>
-                <w:szCs w:val="24"/>
-                <w:lang w:val="es-MX"/>
-              </w:rPr>
-              <w:t>Descripción</w:t>
-            </w:r>
-          </w:p>
-        </w:tc>
-        <w:tc>
-          <w:tcPr>
-            <w:tcW w:w="2928" w:type="dxa"/>
-            <w:shd w:val="clear" w:color="auto" w:fill="262626" w:themeFill="text1" w:themeFillTint="D9"/>
-            <w:vAlign w:val="center"/>
-          </w:tcPr>
-          <w:p>
-            <w:pPr>
-              <w:pStyle w:val="Ttulo3"/>
-              <w:spacing w:before="0" w:after="0"/>
-              <w:jc w:val="center"/>
-              <w:rPr>
-                <w:rFonts w:ascii="Aptos" w:hAnsi="Aptos"/>
-                <w:b/>
-                <w:bCs/>
-                <w:color w:val="auto"/>
-                <w:sz w:val="24"/>
-                <w:szCs w:val="24"/>
-                <w:lang w:val="es-MX"/>
-              </w:rPr>
-            </w:pPr>
-            <w:r>
-              <w:rPr>
-                <w:rFonts w:ascii="Aptos" w:hAnsi="Aptos"/>
-                <w:b/>
-                <w:bCs/>
-                <w:color w:val="auto"/>
-                <w:sz w:val="24"/>
-                <w:szCs w:val="24"/>
-                <w:lang w:val="es-MX"/>
-              </w:rPr>
-              <w:t>¿Cuándo se requiere?</w:t>
-            </w:r>
-          </w:p>
-        </w:tc>
-        <w:tc>
-          <w:tcPr>
-            <w:tcW w:w="2929" w:type="dxa"/>
-            <w:shd w:val="clear" w:color="auto" w:fill="262626" w:themeFill="text1" w:themeFillTint="D9"/>
-            <w:vAlign w:val="center"/>
-          </w:tcPr>
-          <w:p>
-            <w:pPr>
-              <w:pStyle w:val="Ttulo3"/>
-              <w:spacing w:before="0" w:after="0"/>
-              <w:jc w:val="center"/>
-              <w:rPr>
-                <w:rFonts w:ascii="Aptos" w:hAnsi="Aptos"/>
-                <w:b/>
-                <w:bCs/>
-                <w:color w:val="auto"/>
-                <w:sz w:val="24"/>
-                <w:szCs w:val="24"/>
-                <w:lang w:val="es-MX"/>
-              </w:rPr>
-            </w:pPr>
-            <w:r>
-              <w:rPr>
-                <w:rFonts w:ascii="Aptos" w:hAnsi="Aptos"/>
-                <w:b/>
-                <w:bCs/>
-                <w:color w:val="auto"/>
-                <w:sz w:val="24"/>
-                <w:szCs w:val="24"/>
-                <w:lang w:val="es-MX"/>
-              </w:rPr>
-              <w:t>Tiempo</w:t>
-            </w:r>
-          </w:p>
-        </w:tc>
-      </w:tr>
-      <w:tr>
-        <w:trPr>
-          <w:trHeight w:val="318"/>
-          <w:jc w:val="center"/>
-        </w:trPr>
-        <w:tc>
-          <w:tcPr>
-            <w:tcW w:w="4067" w:type="dxa"/>
-            <w:vAlign w:val="center"/>
-          </w:tcPr>
-          <w:p>
-            <w:pPr>
-              <w:rPr>
-                <w:rFonts w:ascii="Aptos" w:hAnsi="Aptos"/>
-                <w:lang w:val="es-MX"/>
-              </w:rPr>
-            </w:pPr>
-          </w:p>
-        </w:tc>
-        <w:tc>
-          <w:tcPr>
-            <w:tcW w:w="2928" w:type="dxa"/>
-            <w:vAlign w:val="center"/>
-          </w:tcPr>
-          <w:p>
-            <w:pPr>
-              <w:rPr>
-                <w:rFonts w:ascii="Aptos" w:hAnsi="Aptos"/>
-                <w:lang w:val="es-MX"/>
-              </w:rPr>
-            </w:pPr>
-          </w:p>
-        </w:tc>
-        <w:tc>
-          <w:tcPr>
-            <w:tcW w:w="2929" w:type="dxa"/>
-            <w:vAlign w:val="center"/>
-          </w:tcPr>
-          <w:p>
-            <w:pPr>
-              <w:rPr>
-                <w:rFonts w:ascii="Aptos" w:hAnsi="Aptos"/>
-                <w:lang w:val="es-MX"/>
-              </w:rPr>
-            </w:pPr>
-          </w:p>
-        </w:tc>
-      </w:tr>
-    </w:tbl>
-    <w:p>
-      <w:pPr>
-        <w:pStyle w:val="Ttulo3"/>
-        <w:rPr>
-          <w:rFonts w:ascii="Aptos" w:hAnsi="Aptos"/>
-          <w:b/>
-          <w:bCs/>
-          <w:color w:val="auto"/>
-          <w:sz w:val="24"/>
-          <w:szCs w:val="24"/>
-          <w:lang w:val="es-MX"/>
-        </w:rPr>
-      </w:pPr>
-      <w:r>
-        <w:rPr>
-          <w:rFonts w:ascii="Aptos" w:hAnsi="Aptos"/>
-          <w:b/>
-          <w:bCs/>
-          <w:color w:val="auto"/>
-          <w:sz w:val="24"/>
-          <w:szCs w:val="24"/>
-          <w:lang w:val="es-MX"/>
-        </w:rPr>
-        <w:t>Reporte de disponibilidad</w:t>
-      </w:r>
-    </w:p>
-    <w:p>
-      <w:pPr>
-        <w:jc w:val="both"/>
-        <w:rPr>
-          <w:rFonts w:ascii="Aptos" w:hAnsi="Aptos"/>
-          <w:lang w:val="es-MX"/>
-        </w:rPr>
-      </w:pPr>
-      <w:r>
-        <w:rPr>
-          <w:rFonts w:ascii="Aptos" w:hAnsi="Aptos"/>
-          <w:lang w:val="es-MX"/>
-        </w:rPr>
-        <w:t>--</w:t>
+        <w:t>Las laptops personales están disponibles de manera inmediata ya que son propiedad de cada integrante. La conexión a internet está disponible tanto en los domicilios de los integrantes como en las instalaciones de la universidad. El hosting y el dominio serán contratados previo al Sprint 4 para garantizar el despliegue oportuno del sistema; su costo está contemplado dentro del presupuesto total del proyecto ($3,000 MXN).</w:t>
       </w:r>
     </w:p>
     <w:p>
@@ -2439,15 +3985,14 @@
           <w:rFonts w:ascii="Aptos" w:hAnsi="Aptos"/>
         </w:rPr>
       </w:pPr>
-      <w:bookmarkStart w:id="9" w:name="_Toc224024564"/>
+      <w:bookmarkStart w:id="17" w:name="_Toc224107872"/>
       <w:r>
         <w:rPr>
           <w:rFonts w:ascii="Aptos" w:hAnsi="Aptos"/>
         </w:rPr>
-        <w:lastRenderedPageBreak/>
         <w:t>Conclusión</w:t>
       </w:r>
-      <w:bookmarkEnd w:id="9"/>
+      <w:bookmarkEnd w:id="17"/>
     </w:p>
     <w:p>
       <w:pPr>
@@ -2462,7 +4007,7 @@
           <w:rFonts w:ascii="Aptos" w:hAnsi="Aptos"/>
           <w:lang w:val="es-MX"/>
         </w:rPr>
-        <w:t>--</w:t>
+        <w:t>El análisis de recursos confirma que el proyecto del Portafolio Digital para Arquitecto Freelancer cuenta con todo lo necesario para su desarrollo. En cuanto a recursos humanos, el equipo de tres integrantes cubre de manera equilibrada los roles de desarrollo backend, frontend y gestión del proyecto, con una distribución de actividades alineada a los Sprints definidos en la metodología Scrum. Los recursos de software son en su totalidad herramientas gratuitas y de libre acceso con las que el equipo ya tiene experiencia, lo que elimina riesgos de licenciamiento o curvas de aprendizaje prolongadas. Finalmente, los recursos del entorno (laptops personales, conectividad, hosting y dominio) están disponibles o serán adquiridos dentro del presupuesto establecido. No se identifican dependencias críticas ni restricciones que comprometan la ejecución del proyecto dentro del plazo y presupuesto planificados.</w:t>
       </w:r>
     </w:p>
     <w:p>
@@ -2483,14 +4028,14 @@
           <w:rFonts w:ascii="Aptos" w:hAnsi="Aptos"/>
         </w:rPr>
       </w:pPr>
-      <w:bookmarkStart w:id="10" w:name="_Toc224024565"/>
+      <w:bookmarkStart w:id="18" w:name="_Toc224107873"/>
       <w:r>
         <w:rPr>
           <w:rFonts w:ascii="Aptos" w:hAnsi="Aptos"/>
         </w:rPr>
         <w:t>Referencias</w:t>
       </w:r>
-      <w:bookmarkEnd w:id="10"/>
+      <w:bookmarkEnd w:id="18"/>
     </w:p>
     <w:p>
       <w:pPr>

</xml_diff>